<commit_message>
Order confirmation company data dynamic
</commit_message>
<xml_diff>
--- a/electron/database/generate-document/templates/order-confirmation-aus.docx
+++ b/electron/database/generate-document/templates/order-confirmation-aus.docx
@@ -473,29 +473,7 @@
                 <w:sz w:val="20"/>
                 <w:szCs w:val="20"/>
               </w:rPr>
-              <w:t xml:space="preserve">Order </w:t>
-            </w:r>
-            <w:proofErr w:type="gramStart"/>
-            <w:r>
-              <w:rPr>
-                <w:rFonts w:asciiTheme="minorHAnsi" w:hAnsiTheme="minorHAnsi" w:cstheme="minorHAnsi"/>
-                <w:b/>
-                <w:bCs/>
-                <w:sz w:val="20"/>
-                <w:szCs w:val="20"/>
-              </w:rPr>
-              <w:t>Confirmation :</w:t>
-            </w:r>
-            <w:proofErr w:type="gramEnd"/>
-            <w:r>
-              <w:rPr>
-                <w:rFonts w:asciiTheme="minorHAnsi" w:hAnsiTheme="minorHAnsi" w:cstheme="minorHAnsi"/>
-                <w:b/>
-                <w:bCs/>
-                <w:sz w:val="20"/>
-                <w:szCs w:val="20"/>
-              </w:rPr>
-              <w:t xml:space="preserve"> </w:t>
+              <w:t xml:space="preserve">Order Confirmation : </w:t>
             </w:r>
             <w:r>
               <w:rPr>
@@ -691,7 +669,6 @@
                 </mc:Fallback>
               </mc:AlternateContent>
             </w:r>
-            <w:proofErr w:type="gramStart"/>
             <w:r>
               <w:rPr>
                 <w:rFonts w:asciiTheme="minorHAnsi" w:hAnsiTheme="minorHAnsi" w:cstheme="minorHAnsi"/>
@@ -715,17 +692,7 @@
                 <w:spacing w:val="-10"/>
                 <w:sz w:val="20"/>
               </w:rPr>
-              <w:t>:</w:t>
-            </w:r>
-            <w:proofErr w:type="gramEnd"/>
-            <w:r>
-              <w:rPr>
-                <w:rFonts w:asciiTheme="minorHAnsi" w:hAnsiTheme="minorHAnsi" w:cstheme="minorHAnsi"/>
-                <w:b/>
-                <w:spacing w:val="-10"/>
-                <w:sz w:val="20"/>
-              </w:rPr>
-              <w:t xml:space="preserve"> </w:t>
+              <w:t xml:space="preserve">: </w:t>
             </w:r>
             <w:r>
               <w:rPr>
@@ -1348,7 +1315,6 @@
               <w:t xml:space="preserve">ASW </w:t>
             </w:r>
             <w:proofErr w:type="spellStart"/>
-            <w:proofErr w:type="gramStart"/>
             <w:r>
               <w:rPr>
                 <w:rFonts w:asciiTheme="minorHAnsi" w:hAnsiTheme="minorHAnsi" w:cstheme="minorHAnsi"/>
@@ -1360,7 +1326,6 @@
               <w:t>PO.No</w:t>
             </w:r>
             <w:proofErr w:type="spellEnd"/>
-            <w:proofErr w:type="gramEnd"/>
           </w:p>
         </w:tc>
         <w:tc>
@@ -1617,7 +1582,6 @@
               <w:t>{#</w:t>
             </w:r>
             <w:proofErr w:type="spellStart"/>
-            <w:proofErr w:type="gramStart"/>
             <w:r>
               <w:rPr>
                 <w:rFonts w:asciiTheme="minorHAnsi" w:hAnsiTheme="minorHAnsi" w:cstheme="minorHAnsi"/>
@@ -1634,46 +1598,17 @@
                 <w:sz w:val="20"/>
                 <w:szCs w:val="20"/>
               </w:rPr>
-              <w:t>}{</w:t>
-            </w:r>
-            <w:proofErr w:type="gramEnd"/>
-            <w:r>
-              <w:rPr>
-                <w:rFonts w:asciiTheme="minorHAnsi" w:hAnsiTheme="minorHAnsi" w:cstheme="minorHAnsi"/>
-                <w:sz w:val="20"/>
-                <w:szCs w:val="20"/>
-              </w:rPr>
-              <w:t>#</w:t>
-            </w:r>
-            <w:proofErr w:type="gramStart"/>
-            <w:r>
-              <w:rPr>
-                <w:rFonts w:asciiTheme="minorHAnsi" w:hAnsiTheme="minorHAnsi" w:cstheme="minorHAnsi"/>
-                <w:sz w:val="20"/>
-                <w:szCs w:val="20"/>
-              </w:rPr>
-              <w:t>showThickness}</w:t>
-            </w:r>
-            <w:r>
-              <w:rPr>
-                <w:rFonts w:asciiTheme="minorHAnsi" w:hAnsiTheme="minorHAnsi" w:cstheme="minorHAnsi"/>
-                <w:b/>
-                <w:bCs/>
-                <w:sz w:val="20"/>
-                <w:szCs w:val="20"/>
-              </w:rPr>
-              <w:t>{</w:t>
-            </w:r>
-            <w:proofErr w:type="gramEnd"/>
-            <w:r>
-              <w:rPr>
-                <w:rFonts w:asciiTheme="minorHAnsi" w:hAnsiTheme="minorHAnsi" w:cstheme="minorHAnsi"/>
-                <w:b/>
-                <w:bCs/>
-                <w:sz w:val="20"/>
-                <w:szCs w:val="20"/>
-              </w:rPr>
-              <w:t>thicknessDetail}</w:t>
+              <w:t>}{#showThickness}</w:t>
+            </w:r>
+            <w:r>
+              <w:rPr>
+                <w:rFonts w:asciiTheme="minorHAnsi" w:hAnsiTheme="minorHAnsi" w:cstheme="minorHAnsi"/>
+                <w:b/>
+                <w:bCs/>
+                <w:sz w:val="20"/>
+                <w:szCs w:val="20"/>
+              </w:rPr>
+              <w:t>{thicknessDetail}</w:t>
             </w:r>
             <w:r>
               <w:rPr>
@@ -1857,7 +1792,6 @@
               <w:t>/</w:t>
             </w:r>
             <w:proofErr w:type="spellStart"/>
-            <w:proofErr w:type="gramStart"/>
             <w:r>
               <w:rPr>
                 <w:rFonts w:asciiTheme="minorHAnsi" w:hAnsiTheme="minorHAnsi" w:cstheme="minorHAnsi"/>
@@ -1898,18 +1832,7 @@
                 <w:sz w:val="20"/>
                 <w:szCs w:val="20"/>
               </w:rPr>
-              <w:t>{</w:t>
-            </w:r>
-            <w:proofErr w:type="gramEnd"/>
-            <w:r>
-              <w:rPr>
-                <w:rFonts w:asciiTheme="minorHAnsi" w:hAnsiTheme="minorHAnsi" w:cstheme="minorHAnsi"/>
-                <w:b/>
-                <w:bCs/>
-                <w:sz w:val="20"/>
-                <w:szCs w:val="20"/>
-              </w:rPr>
-              <w:t>#fsc} - {</w:t>
+              <w:t>{#fsc} - {</w:t>
             </w:r>
             <w:proofErr w:type="spellStart"/>
             <w:r>
@@ -1981,25 +1904,7 @@
                 <w:sz w:val="18"/>
                 <w:szCs w:val="18"/>
               </w:rPr>
-              <w:t>{#</w:t>
-            </w:r>
-            <w:proofErr w:type="gramStart"/>
-            <w:r>
-              <w:rPr>
-                <w:rFonts w:ascii="Arial" w:hAnsi="Arial" w:cs="Arial"/>
-                <w:sz w:val="18"/>
-                <w:szCs w:val="18"/>
-              </w:rPr>
-              <w:t>invoices}{</w:t>
-            </w:r>
-            <w:proofErr w:type="gramEnd"/>
-            <w:r>
-              <w:rPr>
-                <w:rFonts w:ascii="Arial" w:hAnsi="Arial" w:cs="Arial"/>
-                <w:sz w:val="18"/>
-                <w:szCs w:val="18"/>
-              </w:rPr>
-              <w:t>prefixCode}\{containerFrom}{#containerTo} - {</w:t>
+              <w:t>{#invoices}{prefixCode}\{containerFrom}{#containerTo} - {</w:t>
             </w:r>
             <w:proofErr w:type="spellStart"/>
             <w:r>
@@ -2279,25 +2184,7 @@
                 <w:sz w:val="18"/>
                 <w:szCs w:val="18"/>
               </w:rPr>
-              <w:t>{value}{/</w:t>
-            </w:r>
-            <w:proofErr w:type="gramStart"/>
-            <w:r>
-              <w:rPr>
-                <w:rFonts w:ascii="Arial" w:hAnsi="Arial" w:cs="Arial"/>
-                <w:sz w:val="18"/>
-                <w:szCs w:val="18"/>
-              </w:rPr>
-              <w:t>invoices}{</w:t>
-            </w:r>
-            <w:proofErr w:type="gramEnd"/>
-            <w:r>
-              <w:rPr>
-                <w:rFonts w:ascii="Arial" w:hAnsi="Arial" w:cs="Arial"/>
-                <w:sz w:val="18"/>
-                <w:szCs w:val="18"/>
-              </w:rPr>
-              <w:t>/</w:t>
+              <w:t>{value}{/invoices}{/</w:t>
             </w:r>
             <w:proofErr w:type="spellStart"/>
             <w:r>
@@ -2550,25 +2437,7 @@
                 <w:sz w:val="18"/>
                 <w:szCs w:val="18"/>
               </w:rPr>
-              <w:t>{#</w:t>
-            </w:r>
-            <w:proofErr w:type="gramStart"/>
-            <w:r>
-              <w:rPr>
-                <w:rFonts w:ascii="Arial" w:hAnsi="Arial" w:cs="Arial"/>
-                <w:sz w:val="18"/>
-                <w:szCs w:val="18"/>
-              </w:rPr>
-              <w:t>sampleBox}{</w:t>
-            </w:r>
-            <w:proofErr w:type="gramEnd"/>
-            <w:r>
-              <w:rPr>
-                <w:rFonts w:ascii="Arial" w:hAnsi="Arial" w:cs="Arial"/>
-                <w:sz w:val="18"/>
-                <w:szCs w:val="18"/>
-              </w:rPr>
-              <w:t>containerFrom}{#containerTo} to {</w:t>
+              <w:t>{#sampleBox}{containerFrom}{#containerTo} to {</w:t>
             </w:r>
             <w:proofErr w:type="spellStart"/>
             <w:r>
@@ -2632,7 +2501,6 @@
               <w:t>{</w:t>
             </w:r>
             <w:proofErr w:type="spellStart"/>
-            <w:proofErr w:type="gramStart"/>
             <w:r>
               <w:rPr>
                 <w:rFonts w:ascii="Arial" w:hAnsi="Arial" w:cs="Arial"/>
@@ -2687,7 +2555,6 @@
               <w:t>}  {</w:t>
             </w:r>
             <w:proofErr w:type="spellStart"/>
-            <w:proofErr w:type="gramEnd"/>
             <w:r>
               <w:rPr>
                 <w:rFonts w:ascii="Arial" w:hAnsi="Arial" w:cs="Arial"/>
@@ -3884,7 +3751,6 @@
               <w:t>} {</w:t>
             </w:r>
             <w:proofErr w:type="spellStart"/>
-            <w:proofErr w:type="gramStart"/>
             <w:r>
               <w:rPr>
                 <w:rFonts w:ascii="Arial" w:hAnsi="Arial" w:cs="Arial"/>
@@ -3926,7 +3792,6 @@
               <w:t>{</w:t>
             </w:r>
             <w:proofErr w:type="spellStart"/>
-            <w:proofErr w:type="gramEnd"/>
             <w:r>
               <w:rPr>
                 <w:rFonts w:ascii="Arial" w:hAnsi="Arial" w:cs="Arial"/>
@@ -4256,25 +4121,7 @@
                 <w:sz w:val="18"/>
                 <w:szCs w:val="18"/>
               </w:rPr>
-              <w:t>{#</w:t>
-            </w:r>
-            <w:proofErr w:type="gramStart"/>
-            <w:r>
-              <w:rPr>
-                <w:rFonts w:ascii="Arial" w:hAnsi="Arial" w:cs="Arial"/>
-                <w:sz w:val="18"/>
-                <w:szCs w:val="18"/>
-              </w:rPr>
-              <w:t>bBranchOC}{</w:t>
-            </w:r>
-            <w:proofErr w:type="gramEnd"/>
-            <w:r>
-              <w:rPr>
-                <w:rFonts w:ascii="Arial" w:hAnsi="Arial" w:cs="Arial"/>
-                <w:sz w:val="18"/>
-                <w:szCs w:val="18"/>
-              </w:rPr>
-              <w:t>bBranchOC} BRANCH{/</w:t>
+              <w:t>{#bBranchOC}{bBranchOC} BRANCH{/</w:t>
             </w:r>
             <w:proofErr w:type="spellStart"/>
             <w:r>
@@ -4877,8 +4724,12 @@
       </w:pPr>
     </w:p>
     <w:sectPr>
-      <w:headerReference w:type="default" r:id="rId7"/>
-      <w:footerReference w:type="default" r:id="rId8"/>
+      <w:headerReference w:type="even" r:id="rId7"/>
+      <w:headerReference w:type="default" r:id="rId8"/>
+      <w:footerReference w:type="even" r:id="rId9"/>
+      <w:footerReference w:type="default" r:id="rId10"/>
+      <w:headerReference w:type="first" r:id="rId11"/>
+      <w:footerReference w:type="first" r:id="rId12"/>
       <w:pgSz w:w="11906" w:h="16838" w:code="9"/>
       <w:pgMar w:top="0" w:right="0" w:bottom="0" w:left="340" w:header="227" w:footer="0" w:gutter="0"/>
       <w:cols w:space="708"/>
@@ -4913,6 +4764,16 @@
     <w:pPr>
       <w:pStyle w:val="Footer"/>
     </w:pPr>
+  </w:p>
+</w:ftr>
+</file>
+
+<file path=word/footer2.xml><?xml version="1.0" encoding="utf-8"?>
+<w:ftr xmlns:wpc="http://schemas.microsoft.com/office/word/2010/wordprocessingCanvas" xmlns:cx="http://schemas.microsoft.com/office/drawing/2014/chartex" xmlns:cx1="http://schemas.microsoft.com/office/drawing/2015/9/8/chartex" xmlns:cx2="http://schemas.microsoft.com/office/drawing/2015/10/21/chartex" xmlns:cx3="http://schemas.microsoft.com/office/drawing/2016/5/9/chartex" xmlns:cx4="http://schemas.microsoft.com/office/drawing/2016/5/10/chartex" xmlns:cx5="http://schemas.microsoft.com/office/drawing/2016/5/11/chartex" xmlns:cx6="http://schemas.microsoft.com/office/drawing/2016/5/12/chartex" xmlns:cx7="http://schemas.microsoft.com/office/drawing/2016/5/13/chartex" xmlns:cx8="http://schemas.microsoft.com/office/drawing/2016/5/14/chartex" xmlns:mc="http://schemas.openxmlformats.org/markup-compatibility/2006" xmlns:aink="http://schemas.microsoft.com/office/drawing/2016/ink" xmlns:am3d="http://schemas.microsoft.com/office/drawing/2017/model3d" xmlns:o="urn:schemas-microsoft-com:office:office" xmlns:oel="http://schemas.microsoft.com/office/2019/extlst" xmlns:r="http://schemas.openxmlformats.org/officeDocument/2006/relationships" xmlns:m="http://schemas.openxmlformats.org/officeDocument/2006/math" xmlns:v="urn:schemas-microsoft-com:vml" xmlns:wp14="http://schemas.microsoft.com/office/word/2010/wordprocessingDrawing" xmlns:wp="http://schemas.openxmlformats.org/drawingml/2006/wordprocessingDrawing" xmlns:w10="urn:schemas-microsoft-com:office:word" xmlns:w="http://schemas.openxmlformats.org/wordprocessingml/2006/main" xmlns:w14="http://schemas.microsoft.com/office/word/2010/wordml" xmlns:w15="http://schemas.microsoft.com/office/word/2012/wordml" xmlns:w16cex="http://schemas.microsoft.com/office/word/2018/wordml/cex" xmlns:w16cid="http://schemas.microsoft.com/office/word/2016/wordml/cid" xmlns:w16="http://schemas.microsoft.com/office/word/2018/wordml" xmlns:w16du="http://schemas.microsoft.com/office/word/2023/wordml/word16du" xmlns:w16sdtdh="http://schemas.microsoft.com/office/word/2020/wordml/sdtdatahash" xmlns:w16sdtfl="http://schemas.microsoft.com/office/word/2024/wordml/sdtformatlock" xmlns:w16se="http://schemas.microsoft.com/office/word/2015/wordml/symex" xmlns:wpg="http://schemas.microsoft.com/office/word/2010/wordprocessingGroup" xmlns:wpi="http://schemas.microsoft.com/office/word/2010/wordprocessingInk" xmlns:wne="http://schemas.microsoft.com/office/word/2006/wordml" xmlns:wps="http://schemas.microsoft.com/office/word/2010/wordprocessingShape" mc:Ignorable="w14 w15 w16se w16cid w16 w16cex w16sdtdh w16sdtfl w16du wp14">
+  <w:p>
+    <w:pPr>
+      <w:pStyle w:val="Footer"/>
+    </w:pPr>
     <w:r>
       <w:t xml:space="preserve">      Thanking You,</w:t>
     </w:r>
@@ -4927,64 +4788,50 @@
     <w:r>
       <w:t xml:space="preserve">      </w:t>
     </w:r>
-    <w:proofErr w:type="gramStart"/>
     <w:r>
       <w:rPr>
-        <w:spacing w:val="60"/>
+        <w:lang w:val="en-IN"/>
       </w:rPr>
-      <w:t>ALFA</w:t>
+      <w:t>{#</w:t>
     </w:r>
     <w:r>
       <w:rPr>
-        <w:spacing w:val="60"/>
+        <w:lang w:val="en-IN"/>
       </w:rPr>
-      <w:t xml:space="preserve"> </w:t>
+      <w:t>companyData</w:t>
     </w:r>
     <w:r>
       <w:rPr>
-        <w:spacing w:val="60"/>
+        <w:lang w:val="en-IN"/>
       </w:rPr>
-      <w:t xml:space="preserve"> ICA</w:t>
-    </w:r>
-    <w:proofErr w:type="gramEnd"/>
-    <w:r>
-      <w:rPr>
-        <w:spacing w:val="60"/>
-      </w:rPr>
-      <w:t xml:space="preserve"> </w:t>
+      <w:t>}</w:t>
     </w:r>
     <w:r>
       <w:rPr>
-        <w:spacing w:val="60"/>
+        <w:spacing w:val="100"/>
+        <w:lang w:val="en-IN"/>
       </w:rPr>
-      <w:t xml:space="preserve"> </w:t>
+      <w:t>{companyName}{</w:t>
     </w:r>
     <w:r>
       <w:rPr>
-        <w:spacing w:val="60"/>
+        <w:spacing w:val="100"/>
+        <w:lang w:val="en-IN"/>
       </w:rPr>
-      <w:t>(I</w:t>
-    </w:r>
-    <w:proofErr w:type="gramStart"/>
-    <w:r>
-      <w:rPr>
-        <w:spacing w:val="60"/>
-      </w:rPr>
-      <w:t>)</w:t>
+      <w:t>/</w:t>
     </w:r>
     <w:r>
       <w:rPr>
-        <w:spacing w:val="60"/>
+        <w:lang w:val="en-IN"/>
       </w:rPr>
-      <w:t xml:space="preserve"> </w:t>
+      <w:t>companyData</w:t>
     </w:r>
     <w:r>
       <w:rPr>
-        <w:spacing w:val="60"/>
+        <w:lang w:val="en-IN"/>
       </w:rPr>
-      <w:t xml:space="preserve"> LTD</w:t>
+      <w:t>}</w:t>
     </w:r>
-    <w:proofErr w:type="gramEnd"/>
   </w:p>
   <w:p>
     <w:pPr>
@@ -5004,6 +4851,16 @@
       <w:t xml:space="preserve">                                     DIRECTOR</w:t>
     </w:r>
   </w:p>
+  <w:p>
+    <w:pPr>
+      <w:pStyle w:val="Footer"/>
+    </w:pPr>
+  </w:p>
+</w:ftr>
+</file>
+
+<file path=word/footer3.xml><?xml version="1.0" encoding="utf-8"?>
+<w:ftr xmlns:wpc="http://schemas.microsoft.com/office/word/2010/wordprocessingCanvas" xmlns:cx="http://schemas.microsoft.com/office/drawing/2014/chartex" xmlns:cx1="http://schemas.microsoft.com/office/drawing/2015/9/8/chartex" xmlns:cx2="http://schemas.microsoft.com/office/drawing/2015/10/21/chartex" xmlns:cx3="http://schemas.microsoft.com/office/drawing/2016/5/9/chartex" xmlns:cx4="http://schemas.microsoft.com/office/drawing/2016/5/10/chartex" xmlns:cx5="http://schemas.microsoft.com/office/drawing/2016/5/11/chartex" xmlns:cx6="http://schemas.microsoft.com/office/drawing/2016/5/12/chartex" xmlns:cx7="http://schemas.microsoft.com/office/drawing/2016/5/13/chartex" xmlns:cx8="http://schemas.microsoft.com/office/drawing/2016/5/14/chartex" xmlns:mc="http://schemas.openxmlformats.org/markup-compatibility/2006" xmlns:aink="http://schemas.microsoft.com/office/drawing/2016/ink" xmlns:am3d="http://schemas.microsoft.com/office/drawing/2017/model3d" xmlns:o="urn:schemas-microsoft-com:office:office" xmlns:oel="http://schemas.microsoft.com/office/2019/extlst" xmlns:r="http://schemas.openxmlformats.org/officeDocument/2006/relationships" xmlns:m="http://schemas.openxmlformats.org/officeDocument/2006/math" xmlns:v="urn:schemas-microsoft-com:vml" xmlns:wp14="http://schemas.microsoft.com/office/word/2010/wordprocessingDrawing" xmlns:wp="http://schemas.openxmlformats.org/drawingml/2006/wordprocessingDrawing" xmlns:w10="urn:schemas-microsoft-com:office:word" xmlns:w="http://schemas.openxmlformats.org/wordprocessingml/2006/main" xmlns:w14="http://schemas.microsoft.com/office/word/2010/wordml" xmlns:w15="http://schemas.microsoft.com/office/word/2012/wordml" xmlns:w16cex="http://schemas.microsoft.com/office/word/2018/wordml/cex" xmlns:w16cid="http://schemas.microsoft.com/office/word/2016/wordml/cid" xmlns:w16="http://schemas.microsoft.com/office/word/2018/wordml" xmlns:w16du="http://schemas.microsoft.com/office/word/2023/wordml/word16du" xmlns:w16sdtdh="http://schemas.microsoft.com/office/word/2020/wordml/sdtdatahash" xmlns:w16sdtfl="http://schemas.microsoft.com/office/word/2024/wordml/sdtformatlock" xmlns:w16se="http://schemas.microsoft.com/office/word/2015/wordml/symex" xmlns:wpg="http://schemas.microsoft.com/office/word/2010/wordprocessingGroup" xmlns:wpi="http://schemas.microsoft.com/office/word/2010/wordprocessingInk" xmlns:wne="http://schemas.microsoft.com/office/word/2006/wordml" xmlns:wps="http://schemas.microsoft.com/office/word/2010/wordprocessingShape" mc:Ignorable="w14 w15 w16se w16cid w16 w16cex w16sdtdh w16sdtfl w16du wp14">
   <w:p>
     <w:pPr>
       <w:pStyle w:val="Footer"/>
@@ -5035,302 +4892,96 @@
 <w:hdr xmlns:wpc="http://schemas.microsoft.com/office/word/2010/wordprocessingCanvas" xmlns:cx="http://schemas.microsoft.com/office/drawing/2014/chartex" xmlns:cx1="http://schemas.microsoft.com/office/drawing/2015/9/8/chartex" xmlns:cx2="http://schemas.microsoft.com/office/drawing/2015/10/21/chartex" xmlns:cx3="http://schemas.microsoft.com/office/drawing/2016/5/9/chartex" xmlns:cx4="http://schemas.microsoft.com/office/drawing/2016/5/10/chartex" xmlns:cx5="http://schemas.microsoft.com/office/drawing/2016/5/11/chartex" xmlns:cx6="http://schemas.microsoft.com/office/drawing/2016/5/12/chartex" xmlns:cx7="http://schemas.microsoft.com/office/drawing/2016/5/13/chartex" xmlns:cx8="http://schemas.microsoft.com/office/drawing/2016/5/14/chartex" xmlns:mc="http://schemas.openxmlformats.org/markup-compatibility/2006" xmlns:aink="http://schemas.microsoft.com/office/drawing/2016/ink" xmlns:am3d="http://schemas.microsoft.com/office/drawing/2017/model3d" xmlns:o="urn:schemas-microsoft-com:office:office" xmlns:oel="http://schemas.microsoft.com/office/2019/extlst" xmlns:r="http://schemas.openxmlformats.org/officeDocument/2006/relationships" xmlns:m="http://schemas.openxmlformats.org/officeDocument/2006/math" xmlns:v="urn:schemas-microsoft-com:vml" xmlns:wp14="http://schemas.microsoft.com/office/word/2010/wordprocessingDrawing" xmlns:wp="http://schemas.openxmlformats.org/drawingml/2006/wordprocessingDrawing" xmlns:w10="urn:schemas-microsoft-com:office:word" xmlns:w="http://schemas.openxmlformats.org/wordprocessingml/2006/main" xmlns:w14="http://schemas.microsoft.com/office/word/2010/wordml" xmlns:w15="http://schemas.microsoft.com/office/word/2012/wordml" xmlns:w16cex="http://schemas.microsoft.com/office/word/2018/wordml/cex" xmlns:w16cid="http://schemas.microsoft.com/office/word/2016/wordml/cid" xmlns:w16="http://schemas.microsoft.com/office/word/2018/wordml" xmlns:w16du="http://schemas.microsoft.com/office/word/2023/wordml/word16du" xmlns:w16sdtdh="http://schemas.microsoft.com/office/word/2020/wordml/sdtdatahash" xmlns:w16sdtfl="http://schemas.microsoft.com/office/word/2024/wordml/sdtformatlock" xmlns:w16se="http://schemas.microsoft.com/office/word/2015/wordml/symex" xmlns:wpg="http://schemas.microsoft.com/office/word/2010/wordprocessingGroup" xmlns:wpi="http://schemas.microsoft.com/office/word/2010/wordprocessingInk" xmlns:wne="http://schemas.microsoft.com/office/word/2006/wordml" xmlns:wps="http://schemas.microsoft.com/office/word/2010/wordprocessingShape" mc:Ignorable="w14 w15 w16se w16cid w16 w16cex w16sdtdh w16sdtfl w16du wp14">
   <w:p>
     <w:pPr>
-      <w:pStyle w:val="Heading1"/>
-      <w:tabs>
-        <w:tab w:val="left" w:pos="602"/>
-        <w:tab w:val="left" w:pos="1168"/>
-        <w:tab w:val="left" w:pos="1739"/>
-        <w:tab w:val="left" w:pos="2683"/>
-        <w:tab w:val="left" w:pos="3129"/>
-        <w:tab w:val="left" w:pos="3736"/>
-        <w:tab w:val="left" w:pos="4679"/>
-        <w:tab w:val="left" w:pos="5145"/>
-        <w:tab w:val="left" w:pos="5591"/>
-        <w:tab w:val="left" w:pos="6398"/>
-        <w:tab w:val="left" w:pos="6962"/>
-        <w:tab w:val="left" w:pos="7528"/>
-      </w:tabs>
-      <w:spacing w:before="0" w:after="0"/>
+      <w:pStyle w:val="Header"/>
+    </w:pPr>
+  </w:p>
+</w:hdr>
+</file>
+
+<file path=word/header2.xml><?xml version="1.0" encoding="utf-8"?>
+<w:hdr xmlns:wpc="http://schemas.microsoft.com/office/word/2010/wordprocessingCanvas" xmlns:cx="http://schemas.microsoft.com/office/drawing/2014/chartex" xmlns:cx1="http://schemas.microsoft.com/office/drawing/2015/9/8/chartex" xmlns:cx2="http://schemas.microsoft.com/office/drawing/2015/10/21/chartex" xmlns:cx3="http://schemas.microsoft.com/office/drawing/2016/5/9/chartex" xmlns:cx4="http://schemas.microsoft.com/office/drawing/2016/5/10/chartex" xmlns:cx5="http://schemas.microsoft.com/office/drawing/2016/5/11/chartex" xmlns:cx6="http://schemas.microsoft.com/office/drawing/2016/5/12/chartex" xmlns:cx7="http://schemas.microsoft.com/office/drawing/2016/5/13/chartex" xmlns:cx8="http://schemas.microsoft.com/office/drawing/2016/5/14/chartex" xmlns:mc="http://schemas.openxmlformats.org/markup-compatibility/2006" xmlns:aink="http://schemas.microsoft.com/office/drawing/2016/ink" xmlns:am3d="http://schemas.microsoft.com/office/drawing/2017/model3d" xmlns:o="urn:schemas-microsoft-com:office:office" xmlns:oel="http://schemas.microsoft.com/office/2019/extlst" xmlns:r="http://schemas.openxmlformats.org/officeDocument/2006/relationships" xmlns:m="http://schemas.openxmlformats.org/officeDocument/2006/math" xmlns:v="urn:schemas-microsoft-com:vml" xmlns:wp14="http://schemas.microsoft.com/office/word/2010/wordprocessingDrawing" xmlns:wp="http://schemas.openxmlformats.org/drawingml/2006/wordprocessingDrawing" xmlns:w10="urn:schemas-microsoft-com:office:word" xmlns:w="http://schemas.openxmlformats.org/wordprocessingml/2006/main" xmlns:w14="http://schemas.microsoft.com/office/word/2010/wordml" xmlns:w15="http://schemas.microsoft.com/office/word/2012/wordml" xmlns:w16cex="http://schemas.microsoft.com/office/word/2018/wordml/cex" xmlns:w16cid="http://schemas.microsoft.com/office/word/2016/wordml/cid" xmlns:w16="http://schemas.microsoft.com/office/word/2018/wordml" xmlns:w16du="http://schemas.microsoft.com/office/word/2023/wordml/word16du" xmlns:w16sdtdh="http://schemas.microsoft.com/office/word/2020/wordml/sdtdatahash" xmlns:w16sdtfl="http://schemas.microsoft.com/office/word/2024/wordml/sdtformatlock" xmlns:w16se="http://schemas.microsoft.com/office/word/2015/wordml/symex" xmlns:wpg="http://schemas.microsoft.com/office/word/2010/wordprocessingGroup" xmlns:wpi="http://schemas.microsoft.com/office/word/2010/wordprocessingInk" xmlns:wne="http://schemas.microsoft.com/office/word/2006/wordml" xmlns:wps="http://schemas.microsoft.com/office/word/2010/wordprocessingShape" mc:Ignorable="w14 w15 w16se w16cid w16 w16cex w16sdtdh w16sdtfl w16du wp14">
+  <w:p>
+    <w:pPr>
+      <w:spacing w:line="276" w:lineRule="auto"/>
       <w:jc w:val="center"/>
       <w:rPr>
         <w:rFonts w:ascii="Arial" w:hAnsi="Arial" w:cs="Arial"/>
         <w:b/>
         <w:bCs/>
-        <w:color w:val="auto"/>
+        <w:spacing w:val="280"/>
+        <w:sz w:val="40"/>
+        <w:szCs w:val="40"/>
+        <w:lang w:val="en-IN"/>
       </w:rPr>
     </w:pPr>
     <w:r>
       <w:rPr>
-        <w:rFonts w:ascii="Arial" w:hAnsi="Arial" w:cs="Arial"/>
-        <w:b/>
-        <w:bCs/>
-        <w:color w:val="auto"/>
-        <w:spacing w:val="-10"/>
+        <w:lang w:val="en-IN"/>
       </w:rPr>
-      <w:t>A</w:t>
+      <w:t>{#</w:t>
+    </w:r>
+    <w:r>
+      <w:rPr>
+        <w:lang w:val="en-IN"/>
+      </w:rPr>
+      <w:t>companyData</w:t>
+    </w:r>
+    <w:r>
+      <w:rPr>
+        <w:lang w:val="en-IN"/>
+      </w:rPr>
+      <w:t>}</w:t>
     </w:r>
     <w:r>
       <w:rPr>
         <w:rFonts w:ascii="Arial" w:hAnsi="Arial" w:cs="Arial"/>
         <w:b/>
         <w:bCs/>
-        <w:color w:val="auto"/>
+        <w:spacing w:val="280"/>
+        <w:sz w:val="40"/>
+        <w:szCs w:val="40"/>
+        <w:lang w:val="en-IN"/>
       </w:rPr>
-      <w:tab/>
+      <w:t>{</w:t>
     </w:r>
+    <w:proofErr w:type="spellStart"/>
     <w:r>
       <w:rPr>
         <w:rFonts w:ascii="Arial" w:hAnsi="Arial" w:cs="Arial"/>
         <w:b/>
         <w:bCs/>
-        <w:color w:val="auto"/>
-        <w:spacing w:val="-10"/>
+        <w:spacing w:val="280"/>
+        <w:sz w:val="40"/>
+        <w:szCs w:val="40"/>
       </w:rPr>
-      <w:t>L</w:t>
+      <w:t>companyName</w:t>
     </w:r>
+    <w:proofErr w:type="spellEnd"/>
     <w:r>
       <w:rPr>
         <w:rFonts w:ascii="Arial" w:hAnsi="Arial" w:cs="Arial"/>
         <w:b/>
         <w:bCs/>
-        <w:color w:val="auto"/>
+        <w:spacing w:val="280"/>
+        <w:sz w:val="40"/>
+        <w:szCs w:val="40"/>
+        <w:lang w:val="en-IN"/>
       </w:rPr>
-      <w:tab/>
+      <w:t>}</w:t>
     </w:r>
-    <w:r>
+  </w:p>
+  <w:p>
+    <w:pPr>
+      <w:spacing w:line="276" w:lineRule="auto"/>
+      <w:jc w:val="center"/>
       <w:rPr>
         <w:rFonts w:ascii="Arial" w:hAnsi="Arial" w:cs="Arial"/>
         <w:b/>
         <w:bCs/>
-        <w:color w:val="auto"/>
-        <w:spacing w:val="-10"/>
-      </w:rPr>
-      <w:t>F</w:t>
-    </w:r>
-    <w:r>
-      <w:rPr>
-        <w:rFonts w:ascii="Arial" w:hAnsi="Arial" w:cs="Arial"/>
-        <w:b/>
-        <w:bCs/>
-        <w:color w:val="auto"/>
-      </w:rPr>
-      <w:tab/>
-    </w:r>
-    <w:r>
-      <w:rPr>
-        <w:rFonts w:ascii="Arial" w:hAnsi="Arial" w:cs="Arial"/>
-        <w:b/>
-        <w:bCs/>
-        <w:color w:val="auto"/>
-        <w:spacing w:val="-10"/>
-      </w:rPr>
-      <w:t>A</w:t>
-    </w:r>
-    <w:r>
-      <w:rPr>
-        <w:rFonts w:ascii="Arial" w:hAnsi="Arial" w:cs="Arial"/>
-        <w:b/>
-        <w:bCs/>
-        <w:color w:val="auto"/>
-      </w:rPr>
-      <w:tab/>
-    </w:r>
-    <w:r>
-      <w:rPr>
-        <w:rFonts w:ascii="Arial" w:hAnsi="Arial" w:cs="Arial"/>
-        <w:b/>
-        <w:bCs/>
-        <w:color w:val="auto"/>
-        <w:spacing w:val="-10"/>
-      </w:rPr>
-      <w:t>I</w:t>
-    </w:r>
-    <w:r>
-      <w:rPr>
-        <w:rFonts w:ascii="Arial" w:hAnsi="Arial" w:cs="Arial"/>
-        <w:b/>
-        <w:bCs/>
-        <w:color w:val="auto"/>
-      </w:rPr>
-      <w:tab/>
-    </w:r>
-    <w:r>
-      <w:rPr>
-        <w:rFonts w:ascii="Arial" w:hAnsi="Arial" w:cs="Arial"/>
-        <w:b/>
-        <w:bCs/>
-        <w:color w:val="auto"/>
-        <w:spacing w:val="-10"/>
-      </w:rPr>
-      <w:t>C</w:t>
-    </w:r>
-    <w:r>
-      <w:rPr>
-        <w:rFonts w:ascii="Arial" w:hAnsi="Arial" w:cs="Arial"/>
-        <w:b/>
-        <w:bCs/>
-        <w:color w:val="auto"/>
-      </w:rPr>
-      <w:tab/>
-    </w:r>
-    <w:r>
-      <w:rPr>
-        <w:rFonts w:ascii="Arial" w:hAnsi="Arial" w:cs="Arial"/>
-        <w:b/>
-        <w:bCs/>
-        <w:color w:val="auto"/>
-        <w:spacing w:val="-10"/>
-      </w:rPr>
-      <w:t>A</w:t>
-    </w:r>
-    <w:r>
-      <w:rPr>
-        <w:rFonts w:ascii="Arial" w:hAnsi="Arial" w:cs="Arial"/>
-        <w:b/>
-        <w:bCs/>
-        <w:color w:val="auto"/>
-      </w:rPr>
-      <w:tab/>
-    </w:r>
-    <w:r>
-      <w:rPr>
-        <w:rFonts w:ascii="Arial" w:hAnsi="Arial" w:cs="Arial"/>
-        <w:b/>
-        <w:bCs/>
-        <w:color w:val="auto"/>
-        <w:spacing w:val="-10"/>
-      </w:rPr>
-      <w:t>(</w:t>
-    </w:r>
-    <w:r>
-      <w:rPr>
-        <w:rFonts w:ascii="Arial" w:hAnsi="Arial" w:cs="Arial"/>
-        <w:b/>
-        <w:bCs/>
-        <w:color w:val="auto"/>
-      </w:rPr>
-      <w:tab/>
-    </w:r>
-    <w:r>
-      <w:rPr>
-        <w:rFonts w:ascii="Arial" w:hAnsi="Arial" w:cs="Arial"/>
-        <w:b/>
-        <w:bCs/>
-        <w:color w:val="auto"/>
-        <w:spacing w:val="-10"/>
-      </w:rPr>
-      <w:t>I</w:t>
-    </w:r>
-    <w:r>
-      <w:rPr>
-        <w:rFonts w:ascii="Arial" w:hAnsi="Arial" w:cs="Arial"/>
-        <w:b/>
-        <w:bCs/>
-        <w:color w:val="auto"/>
-      </w:rPr>
-      <w:tab/>
-    </w:r>
-    <w:r>
-      <w:rPr>
-        <w:rFonts w:ascii="Arial" w:hAnsi="Arial" w:cs="Arial"/>
-        <w:b/>
-        <w:bCs/>
-        <w:color w:val="auto"/>
-        <w:spacing w:val="-10"/>
-      </w:rPr>
-      <w:t>)</w:t>
-    </w:r>
-    <w:r>
-      <w:rPr>
-        <w:rFonts w:ascii="Arial" w:hAnsi="Arial" w:cs="Arial"/>
-        <w:b/>
-        <w:bCs/>
-        <w:color w:val="auto"/>
-      </w:rPr>
-      <w:tab/>
-    </w:r>
-    <w:r>
-      <w:rPr>
-        <w:rFonts w:ascii="Arial" w:hAnsi="Arial" w:cs="Arial"/>
-        <w:b/>
-        <w:bCs/>
-        <w:color w:val="auto"/>
-        <w:spacing w:val="-10"/>
-      </w:rPr>
-      <w:t>L</w:t>
-    </w:r>
-    <w:r>
-      <w:rPr>
-        <w:rFonts w:ascii="Arial" w:hAnsi="Arial" w:cs="Arial"/>
-        <w:b/>
-        <w:bCs/>
-        <w:color w:val="auto"/>
-      </w:rPr>
-      <w:tab/>
-    </w:r>
-    <w:r>
-      <w:rPr>
-        <w:rFonts w:ascii="Arial" w:hAnsi="Arial" w:cs="Arial"/>
-        <w:b/>
-        <w:bCs/>
-        <w:color w:val="auto"/>
-        <w:spacing w:val="-10"/>
-      </w:rPr>
-      <w:t>T</w:t>
-    </w:r>
-    <w:r>
-      <w:rPr>
-        <w:rFonts w:ascii="Arial" w:hAnsi="Arial" w:cs="Arial"/>
-        <w:b/>
-        <w:bCs/>
-        <w:color w:val="auto"/>
-      </w:rPr>
-      <w:tab/>
-    </w:r>
-    <w:proofErr w:type="gramStart"/>
-    <w:r>
-      <w:rPr>
-        <w:rFonts w:ascii="Arial" w:hAnsi="Arial" w:cs="Arial"/>
-        <w:b/>
-        <w:bCs/>
-        <w:color w:val="auto"/>
-      </w:rPr>
-      <w:t>D</w:t>
-    </w:r>
-    <w:r>
-      <w:rPr>
-        <w:rFonts w:ascii="Arial" w:hAnsi="Arial" w:cs="Arial"/>
-        <w:b/>
-        <w:bCs/>
-        <w:color w:val="auto"/>
-        <w:spacing w:val="-3"/>
-      </w:rPr>
-      <w:t xml:space="preserve"> </w:t>
-    </w:r>
-    <w:r>
-      <w:rPr>
-        <w:rFonts w:ascii="Arial" w:hAnsi="Arial" w:cs="Arial"/>
-        <w:b/>
-        <w:bCs/>
-        <w:color w:val="auto"/>
-        <w:spacing w:val="-10"/>
-      </w:rPr>
-      <w:t>.</w:t>
-    </w:r>
-    <w:proofErr w:type="gramEnd"/>
-  </w:p>
-  <w:p>
-    <w:pPr>
-      <w:tabs>
-        <w:tab w:val="left" w:pos="4091"/>
-        <w:tab w:val="left" w:pos="6161"/>
-      </w:tabs>
-      <w:spacing w:line="320" w:lineRule="exact"/>
-      <w:jc w:val="center"/>
-      <w:rPr>
-        <w:rFonts w:ascii="Arial" w:hAnsi="Arial" w:cs="Arial"/>
-        <w:b/>
-        <w:sz w:val="20"/>
+        <w:spacing w:val="280"/>
+        <w:sz w:val="36"/>
+        <w:szCs w:val="36"/>
+        <w:lang w:val="en-IN"/>
       </w:rPr>
     </w:pPr>
     <w:r>
@@ -5339,7 +4990,7 @@
         <w:b/>
         <w:sz w:val="20"/>
       </w:rPr>
-      <w:t>ALFA PALAZZO, NEAR SHIVRANJANI X ROAD, SATELLITE,</w:t>
+      <w:t>{</w:t>
     </w:r>
     <w:r>
       <w:rPr>
@@ -5347,17 +4998,7 @@
         <w:b/>
         <w:sz w:val="20"/>
       </w:rPr>
-      <w:tab/>
-      <w:t>AHMEDABAD-380</w:t>
-    </w:r>
-    <w:r>
-      <w:rPr>
-        <w:rFonts w:ascii="Arial" w:hAnsi="Arial" w:cs="Arial"/>
-        <w:b/>
-        <w:spacing w:val="-14"/>
-        <w:sz w:val="20"/>
-      </w:rPr>
-      <w:t xml:space="preserve"> </w:t>
+      <w:t>companyAddressLine1</w:t>
     </w:r>
     <w:r>
       <w:rPr>
@@ -5365,7 +5006,59 @@
         <w:b/>
         <w:sz w:val="20"/>
       </w:rPr>
-      <w:t>015</w:t>
+      <w:t>},  {</w:t>
+    </w:r>
+    <w:r>
+      <w:rPr>
+        <w:rFonts w:ascii="Arial" w:hAnsi="Arial" w:cs="Arial"/>
+        <w:b/>
+        <w:sz w:val="20"/>
+      </w:rPr>
+      <w:t>companyAddressLine2</w:t>
+    </w:r>
+    <w:r>
+      <w:rPr>
+        <w:rFonts w:ascii="Arial" w:hAnsi="Arial" w:cs="Arial"/>
+        <w:b/>
+        <w:sz w:val="20"/>
+      </w:rPr>
+      <w:t>},      {</w:t>
+    </w:r>
+    <w:proofErr w:type="spellStart"/>
+    <w:r>
+      <w:rPr>
+        <w:rFonts w:ascii="Arial" w:hAnsi="Arial" w:cs="Arial"/>
+        <w:b/>
+        <w:sz w:val="20"/>
+      </w:rPr>
+      <w:t>companyCity</w:t>
+    </w:r>
+    <w:proofErr w:type="spellEnd"/>
+    <w:r>
+      <w:rPr>
+        <w:rFonts w:ascii="Arial" w:hAnsi="Arial" w:cs="Arial"/>
+        <w:b/>
+        <w:sz w:val="20"/>
+      </w:rPr>
+      <w:t>}-{</w:t>
+    </w:r>
+    <w:proofErr w:type="spellStart"/>
+    <w:r>
+      <w:rPr>
+        <w:rFonts w:ascii="Arial" w:hAnsi="Arial" w:cs="Arial"/>
+        <w:b/>
+        <w:sz w:val="20"/>
+      </w:rPr>
+      <w:t>companyPostalCode</w:t>
+    </w:r>
+    <w:proofErr w:type="spellEnd"/>
+    <w:r>
+      <w:rPr>
+        <w:rFonts w:ascii="Arial" w:hAnsi="Arial" w:cs="Arial"/>
+        <w:b/>
+        <w:sz w:val="20"/>
+      </w:rPr>
+      <w:t>}</w:t>
     </w:r>
   </w:p>
   <w:p>
@@ -5374,13 +5067,14 @@
         <w:tab w:val="left" w:pos="4091"/>
         <w:tab w:val="left" w:pos="6161"/>
       </w:tabs>
-      <w:spacing w:line="320" w:lineRule="exact"/>
+      <w:spacing w:line="276" w:lineRule="auto"/>
       <w:jc w:val="center"/>
       <w:rPr>
         <w:rFonts w:ascii="Arial" w:hAnsi="Arial" w:cs="Arial"/>
         <w:b/>
         <w:sz w:val="20"/>
         <w:szCs w:val="20"/>
+        <w:lang w:val="en-IN"/>
       </w:rPr>
     </w:pPr>
     <w:r>
@@ -5390,7 +5084,17 @@
         <w:sz w:val="20"/>
         <w:szCs w:val="20"/>
       </w:rPr>
-      <w:t>TELEPHONE NO: 26754030</w:t>
+      <w:t>{#</w:t>
+    </w:r>
+    <w:r>
+      <w:rPr>
+        <w:rFonts w:ascii="Arial" w:hAnsi="Arial" w:cs="Arial"/>
+        <w:b/>
+        <w:sz w:val="20"/>
+        <w:szCs w:val="20"/>
+        <w:lang w:val="en-IN"/>
+      </w:rPr>
+      <w:t>telephone</w:t>
     </w:r>
     <w:r>
       <w:rPr>
@@ -5399,30 +5103,7 @@
         <w:sz w:val="20"/>
         <w:szCs w:val="20"/>
       </w:rPr>
-      <w:t xml:space="preserve">      Email – </w:t>
-    </w:r>
-    <w:hyperlink r:id="rId1" w:history="1">
-      <w:r>
-        <w:rPr>
-          <w:rStyle w:val="Hyperlink"/>
-          <w:rFonts w:ascii="Arial" w:hAnsi="Arial" w:cs="Arial"/>
-          <w:b/>
-          <w:color w:val="auto"/>
-          <w:sz w:val="20"/>
-          <w:szCs w:val="20"/>
-          <w:u w:val="none"/>
-        </w:rPr>
-        <w:t>info@alfaica.com</w:t>
-      </w:r>
-    </w:hyperlink>
-    <w:r>
-      <w:rPr>
-        <w:rFonts w:ascii="Arial" w:hAnsi="Arial" w:cs="Arial"/>
-        <w:b/>
-        <w:sz w:val="20"/>
-        <w:szCs w:val="20"/>
-      </w:rPr>
-      <w:t xml:space="preserve">      WEBSITE – www.alfaica.com </w:t>
+      <w:t>}</w:t>
     </w:r>
     <w:r>
       <w:rPr>
@@ -5431,12 +5112,130 @@
         <w:sz w:val="20"/>
         <w:szCs w:val="20"/>
       </w:rPr>
-      <w:tab/>
+      <w:t xml:space="preserve">TELEPHONE NO: </w:t>
+    </w:r>
+    <w:r>
+      <w:rPr>
+        <w:rFonts w:ascii="Arial" w:hAnsi="Arial" w:cs="Arial"/>
+        <w:b/>
+        <w:sz w:val="20"/>
+        <w:szCs w:val="20"/>
+      </w:rPr>
+      <w:t>{</w:t>
+    </w:r>
+    <w:r>
+      <w:rPr>
+        <w:rFonts w:ascii="Arial" w:hAnsi="Arial" w:cs="Arial"/>
+        <w:b/>
+        <w:sz w:val="20"/>
+        <w:szCs w:val="20"/>
+        <w:lang w:val="en-IN"/>
+      </w:rPr>
+      <w:t>telephone</w:t>
+    </w:r>
+    <w:r>
+      <w:rPr>
+        <w:rFonts w:ascii="Arial" w:hAnsi="Arial" w:cs="Arial"/>
+        <w:b/>
+        <w:sz w:val="20"/>
+        <w:szCs w:val="20"/>
+      </w:rPr>
+      <w:t>}{/}</w:t>
+    </w:r>
+    <w:r>
+      <w:rPr>
+        <w:rFonts w:ascii="Arial" w:hAnsi="Arial" w:cs="Arial"/>
+        <w:b/>
+        <w:sz w:val="20"/>
+        <w:szCs w:val="20"/>
+      </w:rPr>
       <w:t xml:space="preserve"> </w:t>
+    </w:r>
+    <w:r>
+      <w:rPr>
+        <w:rFonts w:ascii="Arial" w:hAnsi="Arial" w:cs="Arial"/>
+        <w:b/>
+        <w:sz w:val="20"/>
+        <w:szCs w:val="20"/>
+      </w:rPr>
+      <w:t xml:space="preserve">{#email}   </w:t>
+    </w:r>
+    <w:r>
+      <w:rPr>
+        <w:rFonts w:ascii="Arial" w:hAnsi="Arial" w:cs="Arial"/>
+        <w:b/>
+        <w:sz w:val="20"/>
+        <w:szCs w:val="20"/>
+      </w:rPr>
+      <w:t xml:space="preserve">Email – </w:t>
+    </w:r>
+    <w:r>
+      <w:rPr>
+        <w:rFonts w:ascii="Arial" w:hAnsi="Arial" w:cs="Arial"/>
+        <w:b/>
+        <w:sz w:val="20"/>
+        <w:szCs w:val="20"/>
+      </w:rPr>
+      <w:t>{email}{/}</w:t>
+    </w:r>
+    <w:r>
+      <w:rPr>
+        <w:rFonts w:ascii="Arial" w:hAnsi="Arial" w:cs="Arial"/>
+        <w:b/>
+        <w:sz w:val="20"/>
+        <w:szCs w:val="20"/>
+      </w:rPr>
+      <w:t xml:space="preserve"> </w:t>
+    </w:r>
+    <w:r>
+      <w:rPr>
+        <w:rFonts w:ascii="Arial" w:hAnsi="Arial" w:cs="Arial"/>
+        <w:b/>
+        <w:sz w:val="20"/>
+        <w:szCs w:val="20"/>
+      </w:rPr>
+      <w:t>{#website}</w:t>
+    </w:r>
+    <w:r>
+      <w:rPr>
+        <w:rFonts w:ascii="Arial" w:hAnsi="Arial" w:cs="Arial"/>
+        <w:b/>
+        <w:sz w:val="20"/>
+        <w:szCs w:val="20"/>
+      </w:rPr>
+      <w:t xml:space="preserve"> </w:t>
+    </w:r>
+    <w:r>
+      <w:rPr>
+        <w:rFonts w:ascii="Arial" w:hAnsi="Arial" w:cs="Arial"/>
+        <w:b/>
+        <w:sz w:val="20"/>
+        <w:szCs w:val="20"/>
+      </w:rPr>
+      <w:t xml:space="preserve">  </w:t>
+    </w:r>
+    <w:r>
+      <w:rPr>
+        <w:rFonts w:ascii="Arial" w:hAnsi="Arial" w:cs="Arial"/>
+        <w:b/>
+        <w:sz w:val="20"/>
+        <w:szCs w:val="20"/>
+      </w:rPr>
+      <w:t xml:space="preserve">WEBSITE – </w:t>
+    </w:r>
+    <w:r>
+      <w:rPr>
+        <w:rFonts w:ascii="Arial" w:hAnsi="Arial" w:cs="Arial"/>
+        <w:b/>
+        <w:sz w:val="20"/>
+        <w:szCs w:val="20"/>
+      </w:rPr>
+      <w:t>{website}{/}</w:t>
     </w:r>
   </w:p>
   <w:p>
     <w:pPr>
+      <w:spacing w:line="276" w:lineRule="auto"/>
       <w:jc w:val="center"/>
       <w:rPr>
         <w:rFonts w:ascii="Arial" w:hAnsi="Arial" w:cs="Arial"/>
@@ -5448,71 +5247,54 @@
         <w:rFonts w:ascii="Arial" w:hAnsi="Arial" w:cs="Arial"/>
         <w:sz w:val="20"/>
       </w:rPr>
-      <w:t>an</w:t>
+      <w:t>{#remarks}{remarks}{/}</w:t>
+    </w:r>
+  </w:p>
+  <w:p>
+    <w:pPr>
+      <w:spacing w:line="276" w:lineRule="auto"/>
+      <w:jc w:val="center"/>
+      <w:rPr>
+        <w:lang w:val="en-IN"/>
+      </w:rPr>
+    </w:pPr>
+    <w:r>
+      <w:rPr>
+        <w:rFonts w:ascii="Arial" w:hAnsi="Arial" w:cs="Arial"/>
+        <w:sz w:val="20"/>
+      </w:rPr>
+      <w:t>{#</w:t>
     </w:r>
     <w:r>
       <w:rPr>
         <w:rFonts w:ascii="Arial" w:hAnsi="Arial" w:cs="Arial"/>
-        <w:spacing w:val="-5"/>
+        <w:spacing w:val="-4"/>
         <w:sz w:val="20"/>
       </w:rPr>
-      <w:t xml:space="preserve"> </w:t>
+      <w:t>remark2</w:t>
     </w:r>
     <w:r>
       <w:rPr>
         <w:rFonts w:ascii="Arial" w:hAnsi="Arial" w:cs="Arial"/>
         <w:sz w:val="20"/>
       </w:rPr>
-      <w:t>ISO</w:t>
+      <w:t>}{</w:t>
     </w:r>
     <w:r>
       <w:rPr>
         <w:rFonts w:ascii="Arial" w:hAnsi="Arial" w:cs="Arial"/>
-        <w:spacing w:val="-5"/>
+        <w:spacing w:val="-4"/>
         <w:sz w:val="20"/>
       </w:rPr>
-      <w:t xml:space="preserve"> </w:t>
+      <w:t>remark2</w:t>
     </w:r>
     <w:r>
       <w:rPr>
         <w:rFonts w:ascii="Arial" w:hAnsi="Arial" w:cs="Arial"/>
         <w:sz w:val="20"/>
       </w:rPr>
-      <w:t>9001-20</w:t>
+      <w:t>}{/}</w:t>
     </w:r>
-    <w:r>
-      <w:rPr>
-        <w:rFonts w:ascii="Arial" w:hAnsi="Arial" w:cs="Arial"/>
-        <w:sz w:val="20"/>
-      </w:rPr>
-      <w:t>15</w:t>
-    </w:r>
-    <w:r>
-      <w:rPr>
-        <w:rFonts w:ascii="Arial" w:hAnsi="Arial" w:cs="Arial"/>
-        <w:spacing w:val="-3"/>
-        <w:sz w:val="20"/>
-      </w:rPr>
-      <w:t xml:space="preserve"> </w:t>
-    </w:r>
-    <w:r>
-      <w:rPr>
-        <w:rFonts w:ascii="Arial" w:hAnsi="Arial" w:cs="Arial"/>
-        <w:spacing w:val="-2"/>
-        <w:sz w:val="20"/>
-      </w:rPr>
-      <w:t>Company</w:t>
-    </w:r>
-  </w:p>
-  <w:p>
-    <w:pPr>
-      <w:jc w:val="center"/>
-      <w:rPr>
-        <w:rFonts w:ascii="Arial" w:hAnsi="Arial" w:cs="Arial"/>
-        <w:spacing w:val="-4"/>
-        <w:sz w:val="20"/>
-      </w:rPr>
-    </w:pPr>
     <w:r>
       <w:rPr>
         <w:rFonts w:ascii="Arial" w:hAnsi="Arial" w:cs="Arial"/>
@@ -5521,13 +5303,13 @@
       <mc:AlternateContent>
         <mc:Choice Requires="wps">
           <w:drawing>
-            <wp:anchor distT="0" distB="0" distL="0" distR="0" simplePos="0" relativeHeight="251658240" behindDoc="0" locked="0" layoutInCell="1" allowOverlap="1" wp14:anchorId="534D220C" wp14:editId="522F62A5">
+            <wp:anchor distT="0" distB="0" distL="0" distR="0" simplePos="0" relativeHeight="251659264" behindDoc="0" locked="0" layoutInCell="1" allowOverlap="1" wp14:anchorId="25543641" wp14:editId="2AB210F7">
               <wp:simplePos x="0" y="0"/>
               <wp:positionH relativeFrom="page">
                 <wp:posOffset>140335</wp:posOffset>
               </wp:positionH>
               <wp:positionV relativeFrom="paragraph">
-                <wp:posOffset>210820</wp:posOffset>
+                <wp:posOffset>185420</wp:posOffset>
               </wp:positionV>
               <wp:extent cx="7302500" cy="1270"/>
               <wp:effectExtent l="0" t="0" r="0" b="0"/>
@@ -5591,7 +5373,7 @@
         </mc:Choice>
         <mc:Fallback>
           <w:pict>
-            <v:shape w14:anchorId="2202E482" id="Freeform: Shape 1" o:spid="_x0000_s1026" style="position:absolute;margin-left:11.05pt;margin-top:16.6pt;width:575pt;height:.1pt;z-index:251658240;visibility:visible;mso-wrap-style:square;mso-width-percent:0;mso-height-percent:0;mso-wrap-distance-left:0;mso-wrap-distance-top:0;mso-wrap-distance-right:0;mso-wrap-distance-bottom:0;mso-position-horizontal:absolute;mso-position-horizontal-relative:page;mso-position-vertical:absolute;mso-position-vertical-relative:text;mso-width-percent:0;mso-height-percent:0;mso-width-relative:page;mso-height-relative:page;v-text-anchor:top" coordsize="7302500,1270" o:gfxdata="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" path="m,l7302500,e" filled="f" strokeweight=".72pt">
+            <v:shape w14:anchorId="11108ED0" id="Freeform: Shape 1" o:spid="_x0000_s1026" style="position:absolute;margin-left:11.05pt;margin-top:14.6pt;width:575pt;height:.1pt;z-index:251659264;visibility:visible;mso-wrap-style:square;mso-width-percent:0;mso-height-percent:0;mso-wrap-distance-left:0;mso-wrap-distance-top:0;mso-wrap-distance-right:0;mso-wrap-distance-bottom:0;mso-position-horizontal:absolute;mso-position-horizontal-relative:page;mso-position-vertical:absolute;mso-position-vertical-relative:text;mso-width-percent:0;mso-height-percent:0;mso-width-relative:page;mso-height-relative:page;v-text-anchor:top" coordsize="7302500,1270" o:gfxdata="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" path="m,l7302500,e" filled="f" strokeweight=".72pt">
               <v:path arrowok="t"/>
               <w10:wrap anchorx="page"/>
             </v:shape>
@@ -5601,86 +5383,23 @@
     </w:r>
     <w:r>
       <w:rPr>
-        <w:rFonts w:ascii="Arial" w:hAnsi="Arial" w:cs="Arial"/>
-        <w:sz w:val="20"/>
+        <w:lang w:val="en-IN"/>
       </w:rPr>
-      <w:t>Govt.</w:t>
+      <w:t>{/</w:t>
     </w:r>
+    <w:proofErr w:type="spellStart"/>
     <w:r>
       <w:rPr>
-        <w:rFonts w:ascii="Arial" w:hAnsi="Arial" w:cs="Arial"/>
-        <w:spacing w:val="-8"/>
-        <w:sz w:val="20"/>
+        <w:lang w:val="en-IN"/>
       </w:rPr>
-      <w:t xml:space="preserve"> </w:t>
+      <w:t>companyData</w:t>
     </w:r>
+    <w:proofErr w:type="spellEnd"/>
     <w:r>
       <w:rPr>
-        <w:rFonts w:ascii="Arial" w:hAnsi="Arial" w:cs="Arial"/>
-        <w:sz w:val="20"/>
+        <w:lang w:val="en-IN"/>
       </w:rPr>
-      <w:t>Of</w:t>
-    </w:r>
-    <w:r>
-      <w:rPr>
-        <w:rFonts w:ascii="Arial" w:hAnsi="Arial" w:cs="Arial"/>
-        <w:spacing w:val="-6"/>
-        <w:sz w:val="20"/>
-      </w:rPr>
-      <w:t xml:space="preserve"> </w:t>
-    </w:r>
-    <w:r>
-      <w:rPr>
-        <w:rFonts w:ascii="Arial" w:hAnsi="Arial" w:cs="Arial"/>
-        <w:sz w:val="20"/>
-      </w:rPr>
-      <w:t>India</w:t>
-    </w:r>
-    <w:r>
-      <w:rPr>
-        <w:rFonts w:ascii="Arial" w:hAnsi="Arial" w:cs="Arial"/>
-        <w:spacing w:val="-7"/>
-        <w:sz w:val="20"/>
-      </w:rPr>
-      <w:t xml:space="preserve"> </w:t>
-    </w:r>
-    <w:r>
-      <w:rPr>
-        <w:rFonts w:ascii="Arial" w:hAnsi="Arial" w:cs="Arial"/>
-        <w:sz w:val="20"/>
-      </w:rPr>
-      <w:t>Recognized</w:t>
-    </w:r>
-    <w:r>
-      <w:rPr>
-        <w:rFonts w:ascii="Arial" w:hAnsi="Arial" w:cs="Arial"/>
-        <w:spacing w:val="-4"/>
-        <w:sz w:val="20"/>
-      </w:rPr>
-      <w:t xml:space="preserve"> </w:t>
-    </w:r>
-    <w:r>
-      <w:rPr>
-        <w:rFonts w:ascii="Arial" w:hAnsi="Arial" w:cs="Arial"/>
-        <w:sz w:val="20"/>
-      </w:rPr>
-      <w:t>EXPORT</w:t>
-    </w:r>
-    <w:r>
-      <w:rPr>
-        <w:rFonts w:ascii="Arial" w:hAnsi="Arial" w:cs="Arial"/>
-        <w:spacing w:val="-5"/>
-        <w:sz w:val="20"/>
-      </w:rPr>
-      <w:t xml:space="preserve"> </w:t>
-    </w:r>
-    <w:r>
-      <w:rPr>
-        <w:rFonts w:ascii="Arial" w:hAnsi="Arial" w:cs="Arial"/>
-        <w:spacing w:val="-4"/>
-        <w:sz w:val="20"/>
-      </w:rPr>
-      <w:t>HOUSE</w:t>
+      <w:t>}</w:t>
     </w:r>
   </w:p>
   <w:p>
@@ -5690,6 +5409,16 @@
         <w:rFonts w:ascii="Arial" w:hAnsi="Arial" w:cs="Arial"/>
         <w:sz w:val="20"/>
       </w:rPr>
+    </w:pPr>
+  </w:p>
+</w:hdr>
+</file>
+
+<file path=word/header3.xml><?xml version="1.0" encoding="utf-8"?>
+<w:hdr xmlns:wpc="http://schemas.microsoft.com/office/word/2010/wordprocessingCanvas" xmlns:cx="http://schemas.microsoft.com/office/drawing/2014/chartex" xmlns:cx1="http://schemas.microsoft.com/office/drawing/2015/9/8/chartex" xmlns:cx2="http://schemas.microsoft.com/office/drawing/2015/10/21/chartex" xmlns:cx3="http://schemas.microsoft.com/office/drawing/2016/5/9/chartex" xmlns:cx4="http://schemas.microsoft.com/office/drawing/2016/5/10/chartex" xmlns:cx5="http://schemas.microsoft.com/office/drawing/2016/5/11/chartex" xmlns:cx6="http://schemas.microsoft.com/office/drawing/2016/5/12/chartex" xmlns:cx7="http://schemas.microsoft.com/office/drawing/2016/5/13/chartex" xmlns:cx8="http://schemas.microsoft.com/office/drawing/2016/5/14/chartex" xmlns:mc="http://schemas.openxmlformats.org/markup-compatibility/2006" xmlns:aink="http://schemas.microsoft.com/office/drawing/2016/ink" xmlns:am3d="http://schemas.microsoft.com/office/drawing/2017/model3d" xmlns:o="urn:schemas-microsoft-com:office:office" xmlns:oel="http://schemas.microsoft.com/office/2019/extlst" xmlns:r="http://schemas.openxmlformats.org/officeDocument/2006/relationships" xmlns:m="http://schemas.openxmlformats.org/officeDocument/2006/math" xmlns:v="urn:schemas-microsoft-com:vml" xmlns:wp14="http://schemas.microsoft.com/office/word/2010/wordprocessingDrawing" xmlns:wp="http://schemas.openxmlformats.org/drawingml/2006/wordprocessingDrawing" xmlns:w10="urn:schemas-microsoft-com:office:word" xmlns:w="http://schemas.openxmlformats.org/wordprocessingml/2006/main" xmlns:w14="http://schemas.microsoft.com/office/word/2010/wordml" xmlns:w15="http://schemas.microsoft.com/office/word/2012/wordml" xmlns:w16cex="http://schemas.microsoft.com/office/word/2018/wordml/cex" xmlns:w16cid="http://schemas.microsoft.com/office/word/2016/wordml/cid" xmlns:w16="http://schemas.microsoft.com/office/word/2018/wordml" xmlns:w16du="http://schemas.microsoft.com/office/word/2023/wordml/word16du" xmlns:w16sdtdh="http://schemas.microsoft.com/office/word/2020/wordml/sdtdatahash" xmlns:w16sdtfl="http://schemas.microsoft.com/office/word/2024/wordml/sdtformatlock" xmlns:w16se="http://schemas.microsoft.com/office/word/2015/wordml/symex" xmlns:wpg="http://schemas.microsoft.com/office/word/2010/wordprocessingGroup" xmlns:wpi="http://schemas.microsoft.com/office/word/2010/wordprocessingInk" xmlns:wne="http://schemas.microsoft.com/office/word/2006/wordml" xmlns:wps="http://schemas.microsoft.com/office/word/2010/wordprocessingShape" mc:Ignorable="w14 w15 w16se w16cid w16 w16cex w16sdtdh w16sdtfl w16du wp14">
+  <w:p>
+    <w:pPr>
+      <w:pStyle w:val="Header"/>
     </w:pPr>
   </w:p>
 </w:hdr>

</xml_diff>

<commit_message>
Prefix added for sample box in order confirmation
</commit_message>
<xml_diff>
--- a/electron/database/generate-document/templates/order-confirmation-aus.docx
+++ b/electron/database/generate-document/templates/order-confirmation-aus.docx
@@ -2559,7 +2559,15 @@
                 <w:sz w:val="18"/>
                 <w:szCs w:val="18"/>
               </w:rPr>
-              <w:t>sampleBox}{</w:t>
+              <w:t>sampleBox}</w:t>
+            </w:r>
+            <w:r>
+              <w:rPr>
+                <w:rFonts w:ascii="Arial" w:hAnsi="Arial" w:cs="Arial"/>
+                <w:sz w:val="18"/>
+                <w:szCs w:val="18"/>
+              </w:rPr>
+              <w:t>{</w:t>
             </w:r>
             <w:proofErr w:type="gramEnd"/>
             <w:r>
@@ -2568,7 +2576,15 @@
                 <w:sz w:val="18"/>
                 <w:szCs w:val="18"/>
               </w:rPr>
-              <w:t>containerFrom}{#containerTo} to {</w:t>
+              <w:t>prefixCode}\</w:t>
+            </w:r>
+            <w:r>
+              <w:rPr>
+                <w:rFonts w:ascii="Arial" w:hAnsi="Arial" w:cs="Arial"/>
+                <w:sz w:val="18"/>
+                <w:szCs w:val="18"/>
+              </w:rPr>
+              <w:t>{containerFrom}{#containerTo} to {</w:t>
             </w:r>
             <w:proofErr w:type="spellStart"/>
             <w:r>

</xml_diff>

<commit_message>
Sea freight charges lable added
</commit_message>
<xml_diff>
--- a/electron/database/generate-document/templates/order-confirmation-aus.docx
+++ b/electron/database/generate-document/templates/order-confirmation-aus.docx
@@ -94,29 +94,7 @@
                 <w:sz w:val="20"/>
                 <w:szCs w:val="20"/>
               </w:rPr>
-              <w:t>{</w:t>
-            </w:r>
-            <w:proofErr w:type="spellStart"/>
-            <w:r>
-              <w:rPr>
-                <w:rFonts w:asciiTheme="minorHAnsi" w:hAnsiTheme="minorHAnsi" w:cstheme="minorHAnsi"/>
-                <w:b/>
-                <w:bCs/>
-                <w:sz w:val="20"/>
-                <w:szCs w:val="20"/>
-              </w:rPr>
-              <w:t>consigneeName</w:t>
-            </w:r>
-            <w:proofErr w:type="spellEnd"/>
-            <w:r>
-              <w:rPr>
-                <w:rFonts w:asciiTheme="minorHAnsi" w:hAnsiTheme="minorHAnsi" w:cstheme="minorHAnsi"/>
-                <w:b/>
-                <w:bCs/>
-                <w:sz w:val="20"/>
-                <w:szCs w:val="20"/>
-              </w:rPr>
-              <w:t>}</w:t>
+              <w:t>{consigneeName}</w:t>
             </w:r>
           </w:p>
           <w:p>
@@ -141,29 +119,7 @@
                 <w:sz w:val="20"/>
                 <w:szCs w:val="20"/>
               </w:rPr>
-              <w:t>{</w:t>
-            </w:r>
-            <w:proofErr w:type="spellStart"/>
-            <w:r>
-              <w:rPr>
-                <w:rFonts w:asciiTheme="minorHAnsi" w:hAnsiTheme="minorHAnsi" w:cstheme="minorHAnsi"/>
-                <w:b/>
-                <w:bCs/>
-                <w:sz w:val="20"/>
-                <w:szCs w:val="20"/>
-              </w:rPr>
-              <w:t>consigneeAddress</w:t>
-            </w:r>
-            <w:proofErr w:type="spellEnd"/>
-            <w:r>
-              <w:rPr>
-                <w:rFonts w:asciiTheme="minorHAnsi" w:hAnsiTheme="minorHAnsi" w:cstheme="minorHAnsi"/>
-                <w:b/>
-                <w:bCs/>
-                <w:sz w:val="20"/>
-                <w:szCs w:val="20"/>
-              </w:rPr>
-              <w:t>}</w:t>
+              <w:t>{consigneeAddress}</w:t>
             </w:r>
             <w:r>
               <w:rPr>
@@ -183,29 +139,7 @@
                 <w:sz w:val="20"/>
                 <w:szCs w:val="20"/>
               </w:rPr>
-              <w:t>{</w:t>
-            </w:r>
-            <w:proofErr w:type="spellStart"/>
-            <w:r>
-              <w:rPr>
-                <w:rFonts w:asciiTheme="minorHAnsi" w:hAnsiTheme="minorHAnsi" w:cstheme="minorHAnsi"/>
-                <w:b/>
-                <w:bCs/>
-                <w:sz w:val="20"/>
-                <w:szCs w:val="20"/>
-              </w:rPr>
-              <w:t>consigneeCity</w:t>
-            </w:r>
-            <w:proofErr w:type="spellEnd"/>
-            <w:r>
-              <w:rPr>
-                <w:rFonts w:asciiTheme="minorHAnsi" w:hAnsiTheme="minorHAnsi" w:cstheme="minorHAnsi"/>
-                <w:b/>
-                <w:bCs/>
-                <w:sz w:val="20"/>
-                <w:szCs w:val="20"/>
-              </w:rPr>
-              <w:t>}</w:t>
+              <w:t>{consigneeCity}</w:t>
             </w:r>
             <w:r>
               <w:rPr>
@@ -225,29 +159,7 @@
                 <w:sz w:val="20"/>
                 <w:szCs w:val="20"/>
               </w:rPr>
-              <w:t>{</w:t>
-            </w:r>
-            <w:proofErr w:type="spellStart"/>
-            <w:r>
-              <w:rPr>
-                <w:rFonts w:asciiTheme="minorHAnsi" w:hAnsiTheme="minorHAnsi" w:cstheme="minorHAnsi"/>
-                <w:b/>
-                <w:bCs/>
-                <w:sz w:val="20"/>
-                <w:szCs w:val="20"/>
-              </w:rPr>
-              <w:t>consigneeState</w:t>
-            </w:r>
-            <w:proofErr w:type="spellEnd"/>
-            <w:r>
-              <w:rPr>
-                <w:rFonts w:asciiTheme="minorHAnsi" w:hAnsiTheme="minorHAnsi" w:cstheme="minorHAnsi"/>
-                <w:b/>
-                <w:bCs/>
-                <w:sz w:val="20"/>
-                <w:szCs w:val="20"/>
-              </w:rPr>
-              <w:t>}</w:t>
+              <w:t>{consigneeState}</w:t>
             </w:r>
             <w:r>
               <w:rPr>
@@ -267,29 +179,7 @@
                 <w:sz w:val="20"/>
                 <w:szCs w:val="20"/>
               </w:rPr>
-              <w:t>{</w:t>
-            </w:r>
-            <w:proofErr w:type="spellStart"/>
-            <w:r>
-              <w:rPr>
-                <w:rFonts w:asciiTheme="minorHAnsi" w:hAnsiTheme="minorHAnsi" w:cstheme="minorHAnsi"/>
-                <w:b/>
-                <w:bCs/>
-                <w:sz w:val="20"/>
-                <w:szCs w:val="20"/>
-              </w:rPr>
-              <w:t>consigneeCountry</w:t>
-            </w:r>
-            <w:proofErr w:type="spellEnd"/>
-            <w:r>
-              <w:rPr>
-                <w:rFonts w:asciiTheme="minorHAnsi" w:hAnsiTheme="minorHAnsi" w:cstheme="minorHAnsi"/>
-                <w:b/>
-                <w:bCs/>
-                <w:sz w:val="20"/>
-                <w:szCs w:val="20"/>
-              </w:rPr>
-              <w:t>}</w:t>
+              <w:t>{consigneeCountry}</w:t>
             </w:r>
             <w:r>
               <w:rPr>
@@ -473,55 +363,15 @@
                 <w:sz w:val="20"/>
                 <w:szCs w:val="20"/>
               </w:rPr>
-              <w:t xml:space="preserve">Order </w:t>
-            </w:r>
-            <w:proofErr w:type="gramStart"/>
-            <w:r>
-              <w:rPr>
-                <w:rFonts w:asciiTheme="minorHAnsi" w:hAnsiTheme="minorHAnsi" w:cstheme="minorHAnsi"/>
-                <w:b/>
-                <w:bCs/>
-                <w:sz w:val="20"/>
-                <w:szCs w:val="20"/>
-              </w:rPr>
-              <w:t>Confirmation :</w:t>
-            </w:r>
-            <w:proofErr w:type="gramEnd"/>
-            <w:r>
-              <w:rPr>
-                <w:rFonts w:asciiTheme="minorHAnsi" w:hAnsiTheme="minorHAnsi" w:cstheme="minorHAnsi"/>
-                <w:b/>
-                <w:bCs/>
-                <w:sz w:val="20"/>
-                <w:szCs w:val="20"/>
-              </w:rPr>
-              <w:t xml:space="preserve"> </w:t>
-            </w:r>
-            <w:r>
-              <w:rPr>
-                <w:rFonts w:asciiTheme="minorHAnsi" w:hAnsiTheme="minorHAnsi" w:cstheme="minorHAnsi"/>
-                <w:sz w:val="20"/>
-                <w:szCs w:val="20"/>
-              </w:rPr>
-              <w:t>{</w:t>
-            </w:r>
-            <w:proofErr w:type="spellStart"/>
-            <w:r>
-              <w:rPr>
-                <w:rFonts w:asciiTheme="minorHAnsi" w:hAnsiTheme="minorHAnsi" w:cstheme="minorHAnsi"/>
-                <w:sz w:val="20"/>
-                <w:szCs w:val="20"/>
-              </w:rPr>
-              <w:t>invoicePiNo</w:t>
-            </w:r>
-            <w:proofErr w:type="spellEnd"/>
-            <w:r>
-              <w:rPr>
-                <w:rFonts w:asciiTheme="minorHAnsi" w:hAnsiTheme="minorHAnsi" w:cstheme="minorHAnsi"/>
-                <w:sz w:val="20"/>
-                <w:szCs w:val="20"/>
-              </w:rPr>
-              <w:t>}</w:t>
+              <w:t xml:space="preserve">Order Confirmation : </w:t>
+            </w:r>
+            <w:r>
+              <w:rPr>
+                <w:rFonts w:asciiTheme="minorHAnsi" w:hAnsiTheme="minorHAnsi" w:cstheme="minorHAnsi"/>
+                <w:sz w:val="20"/>
+                <w:szCs w:val="20"/>
+              </w:rPr>
+              <w:t>{invoicePiNo}</w:t>
             </w:r>
           </w:p>
           <w:p>
@@ -691,7 +541,6 @@
                 </mc:Fallback>
               </mc:AlternateContent>
             </w:r>
-            <w:proofErr w:type="gramStart"/>
             <w:r>
               <w:rPr>
                 <w:rFonts w:asciiTheme="minorHAnsi" w:hAnsiTheme="minorHAnsi" w:cstheme="minorHAnsi"/>
@@ -715,17 +564,16 @@
                 <w:spacing w:val="-10"/>
                 <w:sz w:val="20"/>
               </w:rPr>
-              <w:t>:</w:t>
-            </w:r>
-            <w:proofErr w:type="gramEnd"/>
-            <w:r>
-              <w:rPr>
-                <w:rFonts w:asciiTheme="minorHAnsi" w:hAnsiTheme="minorHAnsi" w:cstheme="minorHAnsi"/>
-                <w:b/>
+              <w:t xml:space="preserve">: </w:t>
+            </w:r>
+            <w:r>
+              <w:rPr>
+                <w:rFonts w:asciiTheme="minorHAnsi" w:hAnsiTheme="minorHAnsi" w:cstheme="minorHAnsi"/>
+                <w:bCs/>
                 <w:spacing w:val="-10"/>
                 <w:sz w:val="20"/>
               </w:rPr>
-              <w:t xml:space="preserve"> </w:t>
+              <w:t>{</w:t>
             </w:r>
             <w:r>
               <w:rPr>
@@ -733,21 +581,10 @@
                 <w:bCs/>
                 <w:spacing w:val="-10"/>
                 <w:sz w:val="20"/>
-              </w:rPr>
-              <w:t>{</w:t>
-            </w:r>
-            <w:proofErr w:type="spellStart"/>
-            <w:r>
-              <w:rPr>
-                <w:rFonts w:asciiTheme="minorHAnsi" w:hAnsiTheme="minorHAnsi" w:cstheme="minorHAnsi"/>
-                <w:bCs/>
-                <w:spacing w:val="-10"/>
-                <w:sz w:val="20"/>
                 <w:lang w:val="en-IN"/>
               </w:rPr>
               <w:t>orderDate</w:t>
             </w:r>
-            <w:proofErr w:type="spellEnd"/>
             <w:r>
               <w:rPr>
                 <w:rFonts w:asciiTheme="minorHAnsi" w:hAnsiTheme="minorHAnsi" w:cstheme="minorHAnsi"/>
@@ -860,29 +697,7 @@
                 <w:sz w:val="20"/>
                 <w:szCs w:val="20"/>
               </w:rPr>
-              <w:t>{</w:t>
-            </w:r>
-            <w:proofErr w:type="spellStart"/>
-            <w:r>
-              <w:rPr>
-                <w:rFonts w:asciiTheme="minorHAnsi" w:hAnsiTheme="minorHAnsi" w:cstheme="minorHAnsi"/>
-                <w:b/>
-                <w:bCs/>
-                <w:sz w:val="20"/>
-                <w:szCs w:val="20"/>
-              </w:rPr>
-              <w:t>buyerName</w:t>
-            </w:r>
-            <w:proofErr w:type="spellEnd"/>
-            <w:r>
-              <w:rPr>
-                <w:rFonts w:asciiTheme="minorHAnsi" w:hAnsiTheme="minorHAnsi" w:cstheme="minorHAnsi"/>
-                <w:b/>
-                <w:bCs/>
-                <w:sz w:val="20"/>
-                <w:szCs w:val="20"/>
-              </w:rPr>
-              <w:t>}</w:t>
+              <w:t>{buyerName}</w:t>
             </w:r>
           </w:p>
           <w:p>
@@ -907,29 +722,7 @@
                 <w:sz w:val="20"/>
                 <w:szCs w:val="20"/>
               </w:rPr>
-              <w:t>{</w:t>
-            </w:r>
-            <w:proofErr w:type="spellStart"/>
-            <w:r>
-              <w:rPr>
-                <w:rFonts w:asciiTheme="minorHAnsi" w:hAnsiTheme="minorHAnsi" w:cstheme="minorHAnsi"/>
-                <w:b/>
-                <w:bCs/>
-                <w:sz w:val="20"/>
-                <w:szCs w:val="20"/>
-              </w:rPr>
-              <w:t>buyerAddress</w:t>
-            </w:r>
-            <w:proofErr w:type="spellEnd"/>
-            <w:r>
-              <w:rPr>
-                <w:rFonts w:asciiTheme="minorHAnsi" w:hAnsiTheme="minorHAnsi" w:cstheme="minorHAnsi"/>
-                <w:b/>
-                <w:bCs/>
-                <w:sz w:val="20"/>
-                <w:szCs w:val="20"/>
-              </w:rPr>
-              <w:t>}</w:t>
+              <w:t>{buyerAddress}</w:t>
             </w:r>
           </w:p>
           <w:p>
@@ -954,42 +747,50 @@
                 <w:sz w:val="20"/>
                 <w:szCs w:val="20"/>
               </w:rPr>
-              <w:t>{</w:t>
-            </w:r>
-            <w:proofErr w:type="spellStart"/>
-            <w:r>
-              <w:rPr>
-                <w:rFonts w:asciiTheme="minorHAnsi" w:hAnsiTheme="minorHAnsi" w:cstheme="minorHAnsi"/>
-                <w:b/>
-                <w:bCs/>
-                <w:sz w:val="20"/>
-                <w:szCs w:val="20"/>
-              </w:rPr>
-              <w:t>buyerCity</w:t>
-            </w:r>
-            <w:proofErr w:type="spellEnd"/>
-            <w:r>
-              <w:rPr>
-                <w:rFonts w:asciiTheme="minorHAnsi" w:hAnsiTheme="minorHAnsi" w:cstheme="minorHAnsi"/>
-                <w:b/>
-                <w:bCs/>
-                <w:sz w:val="20"/>
-                <w:szCs w:val="20"/>
-              </w:rPr>
-              <w:t>} {</w:t>
-            </w:r>
-            <w:proofErr w:type="spellStart"/>
-            <w:r>
-              <w:rPr>
-                <w:rFonts w:asciiTheme="minorHAnsi" w:hAnsiTheme="minorHAnsi" w:cstheme="minorHAnsi"/>
-                <w:b/>
-                <w:bCs/>
-                <w:sz w:val="20"/>
-                <w:szCs w:val="20"/>
-              </w:rPr>
-              <w:t>buyerState</w:t>
-            </w:r>
-            <w:proofErr w:type="spellEnd"/>
+              <w:t>{buyerCity} {buyerState}</w:t>
+            </w:r>
+          </w:p>
+          <w:p>
+            <w:pPr>
+              <w:ind w:right="227"/>
+              <w:rPr>
+                <w:rFonts w:asciiTheme="minorHAnsi" w:hAnsiTheme="minorHAnsi" w:cstheme="minorHAnsi"/>
+                <w:b/>
+                <w:spacing w:val="-2"/>
+                <w:sz w:val="20"/>
+                <w:szCs w:val="24"/>
+              </w:rPr>
+            </w:pPr>
+            <w:r>
+              <w:rPr>
+                <w:rFonts w:asciiTheme="minorHAnsi" w:hAnsiTheme="minorHAnsi" w:cstheme="minorHAnsi"/>
+                <w:b/>
+                <w:bCs/>
+                <w:sz w:val="20"/>
+                <w:szCs w:val="20"/>
+              </w:rPr>
+              <w:t xml:space="preserve">{buyerCountry} </w:t>
+            </w:r>
+            <w:r>
+              <w:rPr>
+                <w:rFonts w:asciiTheme="minorHAnsi" w:hAnsiTheme="minorHAnsi" w:cstheme="minorHAnsi"/>
+                <w:b/>
+                <w:bCs/>
+                <w:sz w:val="20"/>
+                <w:szCs w:val="20"/>
+              </w:rPr>
+              <w:t>{#</w:t>
+            </w:r>
+            <w:r>
+              <w:rPr>
+                <w:rFonts w:asciiTheme="minorHAnsi" w:hAnsiTheme="minorHAnsi" w:cstheme="minorHAnsi"/>
+                <w:b/>
+                <w:bCs/>
+                <w:sz w:val="20"/>
+                <w:szCs w:val="20"/>
+              </w:rPr>
+              <w:t>buyerZip</w:t>
+            </w:r>
             <w:r>
               <w:rPr>
                 <w:rFonts w:asciiTheme="minorHAnsi" w:hAnsiTheme="minorHAnsi" w:cstheme="minorHAnsi"/>
@@ -1000,59 +801,25 @@
               </w:rPr>
               <w:t>}</w:t>
             </w:r>
-          </w:p>
-          <w:p>
-            <w:pPr>
-              <w:ind w:right="227"/>
-              <w:rPr>
-                <w:rFonts w:asciiTheme="minorHAnsi" w:hAnsiTheme="minorHAnsi" w:cstheme="minorHAnsi"/>
-                <w:b/>
-                <w:spacing w:val="-2"/>
-                <w:sz w:val="20"/>
-                <w:szCs w:val="24"/>
-              </w:rPr>
-            </w:pPr>
-            <w:r>
-              <w:rPr>
-                <w:rFonts w:asciiTheme="minorHAnsi" w:hAnsiTheme="minorHAnsi" w:cstheme="minorHAnsi"/>
-                <w:b/>
-                <w:bCs/>
-                <w:sz w:val="20"/>
-                <w:szCs w:val="20"/>
-              </w:rPr>
-              <w:t>{</w:t>
-            </w:r>
-            <w:proofErr w:type="spellStart"/>
-            <w:r>
-              <w:rPr>
-                <w:rFonts w:asciiTheme="minorHAnsi" w:hAnsiTheme="minorHAnsi" w:cstheme="minorHAnsi"/>
-                <w:b/>
-                <w:bCs/>
-                <w:sz w:val="20"/>
-                <w:szCs w:val="20"/>
-              </w:rPr>
-              <w:t>buyerCountry</w:t>
-            </w:r>
-            <w:proofErr w:type="spellEnd"/>
-            <w:r>
-              <w:rPr>
-                <w:rFonts w:asciiTheme="minorHAnsi" w:hAnsiTheme="minorHAnsi" w:cstheme="minorHAnsi"/>
-                <w:b/>
-                <w:bCs/>
-                <w:sz w:val="20"/>
-                <w:szCs w:val="20"/>
-              </w:rPr>
-              <w:t xml:space="preserve">} </w:t>
-            </w:r>
-            <w:r>
-              <w:rPr>
-                <w:rFonts w:asciiTheme="minorHAnsi" w:hAnsiTheme="minorHAnsi" w:cstheme="minorHAnsi"/>
-                <w:b/>
-                <w:bCs/>
-                <w:sz w:val="20"/>
-                <w:szCs w:val="20"/>
-              </w:rPr>
-              <w:t>{#</w:t>
+            <w:r>
+              <w:rPr>
+                <w:rFonts w:asciiTheme="minorHAnsi" w:hAnsiTheme="minorHAnsi" w:cstheme="minorHAnsi"/>
+                <w:b/>
+                <w:bCs/>
+                <w:sz w:val="20"/>
+                <w:szCs w:val="20"/>
+              </w:rPr>
+              <w:t>- {buyerZip}</w:t>
+            </w:r>
+            <w:r>
+              <w:rPr>
+                <w:rFonts w:asciiTheme="minorHAnsi" w:hAnsiTheme="minorHAnsi" w:cstheme="minorHAnsi"/>
+                <w:b/>
+                <w:bCs/>
+                <w:sz w:val="20"/>
+                <w:szCs w:val="20"/>
+              </w:rPr>
+              <w:t>{/</w:t>
             </w:r>
             <w:r>
               <w:rPr>
@@ -1064,70 +831,6 @@
               </w:rPr>
               <w:t>buyerZip</w:t>
             </w:r>
-            <w:r>
-              <w:rPr>
-                <w:rFonts w:asciiTheme="minorHAnsi" w:hAnsiTheme="minorHAnsi" w:cstheme="minorHAnsi"/>
-                <w:b/>
-                <w:bCs/>
-                <w:sz w:val="20"/>
-                <w:szCs w:val="20"/>
-              </w:rPr>
-              <w:t>}</w:t>
-            </w:r>
-            <w:r>
-              <w:rPr>
-                <w:rFonts w:asciiTheme="minorHAnsi" w:hAnsiTheme="minorHAnsi" w:cstheme="minorHAnsi"/>
-                <w:b/>
-                <w:bCs/>
-                <w:sz w:val="20"/>
-                <w:szCs w:val="20"/>
-              </w:rPr>
-              <w:t>- {</w:t>
-            </w:r>
-            <w:proofErr w:type="spellStart"/>
-            <w:r>
-              <w:rPr>
-                <w:rFonts w:asciiTheme="minorHAnsi" w:hAnsiTheme="minorHAnsi" w:cstheme="minorHAnsi"/>
-                <w:b/>
-                <w:bCs/>
-                <w:sz w:val="20"/>
-                <w:szCs w:val="20"/>
-              </w:rPr>
-              <w:t>buyerZip</w:t>
-            </w:r>
-            <w:proofErr w:type="spellEnd"/>
-            <w:r>
-              <w:rPr>
-                <w:rFonts w:asciiTheme="minorHAnsi" w:hAnsiTheme="minorHAnsi" w:cstheme="minorHAnsi"/>
-                <w:b/>
-                <w:bCs/>
-                <w:sz w:val="20"/>
-                <w:szCs w:val="20"/>
-              </w:rPr>
-              <w:t>}</w:t>
-            </w:r>
-            <w:r>
-              <w:rPr>
-                <w:rFonts w:asciiTheme="minorHAnsi" w:hAnsiTheme="minorHAnsi" w:cstheme="minorHAnsi"/>
-                <w:b/>
-                <w:bCs/>
-                <w:sz w:val="20"/>
-                <w:szCs w:val="20"/>
-              </w:rPr>
-              <w:t>{/</w:t>
-            </w:r>
-            <w:proofErr w:type="spellStart"/>
-            <w:r>
-              <w:rPr>
-                <w:rFonts w:asciiTheme="minorHAnsi" w:hAnsiTheme="minorHAnsi" w:cstheme="minorHAnsi"/>
-                <w:b/>
-                <w:bCs/>
-                <w:sz w:val="20"/>
-                <w:szCs w:val="20"/>
-              </w:rPr>
-              <w:t>buyerZip</w:t>
-            </w:r>
-            <w:proofErr w:type="spellEnd"/>
             <w:r>
               <w:rPr>
                 <w:rFonts w:asciiTheme="minorHAnsi" w:hAnsiTheme="minorHAnsi" w:cstheme="minorHAnsi"/>
@@ -1345,22 +1048,8 @@
                 <w:sz w:val="20"/>
                 <w:szCs w:val="24"/>
               </w:rPr>
-              <w:t xml:space="preserve">ASW </w:t>
-            </w:r>
-            <w:proofErr w:type="spellStart"/>
-            <w:proofErr w:type="gramStart"/>
-            <w:r>
-              <w:rPr>
-                <w:rFonts w:asciiTheme="minorHAnsi" w:hAnsiTheme="minorHAnsi" w:cstheme="minorHAnsi"/>
-                <w:b/>
-                <w:bCs/>
-                <w:sz w:val="20"/>
-                <w:szCs w:val="24"/>
-              </w:rPr>
-              <w:t>PO.No</w:t>
-            </w:r>
-            <w:proofErr w:type="spellEnd"/>
-            <w:proofErr w:type="gramEnd"/>
+              <w:t>ASW PO.No</w:t>
+            </w:r>
           </w:p>
         </w:tc>
         <w:tc>
@@ -1489,29 +1178,7 @@
                 <w:sz w:val="20"/>
                 <w:szCs w:val="24"/>
               </w:rPr>
-              <w:t>{</w:t>
-            </w:r>
-            <w:proofErr w:type="spellStart"/>
-            <w:r>
-              <w:rPr>
-                <w:rFonts w:asciiTheme="minorHAnsi" w:hAnsiTheme="minorHAnsi" w:cstheme="minorHAnsi"/>
-                <w:b/>
-                <w:bCs/>
-                <w:sz w:val="20"/>
-                <w:szCs w:val="24"/>
-              </w:rPr>
-              <w:t>currencyChar</w:t>
-            </w:r>
-            <w:proofErr w:type="spellEnd"/>
-            <w:r>
-              <w:rPr>
-                <w:rFonts w:asciiTheme="minorHAnsi" w:hAnsiTheme="minorHAnsi" w:cstheme="minorHAnsi"/>
-                <w:b/>
-                <w:bCs/>
-                <w:sz w:val="20"/>
-                <w:szCs w:val="24"/>
-              </w:rPr>
-              <w:t>}</w:t>
+              <w:t>{currencyChar}</w:t>
             </w:r>
           </w:p>
         </w:tc>
@@ -1562,29 +1229,7 @@
                 <w:sz w:val="20"/>
                 <w:szCs w:val="24"/>
               </w:rPr>
-              <w:t>{</w:t>
-            </w:r>
-            <w:proofErr w:type="spellStart"/>
-            <w:r>
-              <w:rPr>
-                <w:rFonts w:asciiTheme="minorHAnsi" w:hAnsiTheme="minorHAnsi" w:cstheme="minorHAnsi"/>
-                <w:b/>
-                <w:bCs/>
-                <w:sz w:val="20"/>
-                <w:szCs w:val="24"/>
-              </w:rPr>
-              <w:t>currencyChar</w:t>
-            </w:r>
-            <w:proofErr w:type="spellEnd"/>
-            <w:r>
-              <w:rPr>
-                <w:rFonts w:asciiTheme="minorHAnsi" w:hAnsiTheme="minorHAnsi" w:cstheme="minorHAnsi"/>
-                <w:b/>
-                <w:bCs/>
-                <w:sz w:val="20"/>
-                <w:szCs w:val="24"/>
-              </w:rPr>
-              <w:t>}</w:t>
+              <w:t>{currencyChar}</w:t>
             </w:r>
           </w:p>
         </w:tc>
@@ -1616,8 +1261,6 @@
               </w:rPr>
               <w:t>{#</w:t>
             </w:r>
-            <w:proofErr w:type="spellStart"/>
-            <w:proofErr w:type="gramStart"/>
             <w:r>
               <w:rPr>
                 <w:rFonts w:asciiTheme="minorHAnsi" w:hAnsiTheme="minorHAnsi" w:cstheme="minorHAnsi"/>
@@ -1627,53 +1270,23 @@
               </w:rPr>
               <w:t>OCItems</w:t>
             </w:r>
-            <w:proofErr w:type="spellEnd"/>
-            <w:r>
-              <w:rPr>
-                <w:rFonts w:asciiTheme="minorHAnsi" w:hAnsiTheme="minorHAnsi" w:cstheme="minorHAnsi"/>
-                <w:sz w:val="20"/>
-                <w:szCs w:val="20"/>
-              </w:rPr>
-              <w:t>}{</w:t>
-            </w:r>
-            <w:proofErr w:type="gramEnd"/>
-            <w:r>
-              <w:rPr>
-                <w:rFonts w:asciiTheme="minorHAnsi" w:hAnsiTheme="minorHAnsi" w:cstheme="minorHAnsi"/>
-                <w:sz w:val="20"/>
-                <w:szCs w:val="20"/>
-              </w:rPr>
-              <w:t>#</w:t>
-            </w:r>
-            <w:proofErr w:type="gramStart"/>
-            <w:r>
-              <w:rPr>
-                <w:rFonts w:asciiTheme="minorHAnsi" w:hAnsiTheme="minorHAnsi" w:cstheme="minorHAnsi"/>
-                <w:sz w:val="20"/>
-                <w:szCs w:val="20"/>
-              </w:rPr>
-              <w:t>showThickness}</w:t>
-            </w:r>
-            <w:r>
-              <w:rPr>
-                <w:rFonts w:asciiTheme="minorHAnsi" w:hAnsiTheme="minorHAnsi" w:cstheme="minorHAnsi"/>
-                <w:b/>
-                <w:bCs/>
-                <w:sz w:val="20"/>
-                <w:szCs w:val="20"/>
-              </w:rPr>
-              <w:t>{</w:t>
-            </w:r>
-            <w:proofErr w:type="gramEnd"/>
-            <w:r>
-              <w:rPr>
-                <w:rFonts w:asciiTheme="minorHAnsi" w:hAnsiTheme="minorHAnsi" w:cstheme="minorHAnsi"/>
-                <w:b/>
-                <w:bCs/>
-                <w:sz w:val="20"/>
-                <w:szCs w:val="20"/>
-              </w:rPr>
-              <w:t>thicknessDetail}</w:t>
+            <w:r>
+              <w:rPr>
+                <w:rFonts w:asciiTheme="minorHAnsi" w:hAnsiTheme="minorHAnsi" w:cstheme="minorHAnsi"/>
+                <w:sz w:val="20"/>
+                <w:szCs w:val="20"/>
+              </w:rPr>
+              <w:t>}{#showThickness}</w:t>
+            </w:r>
+            <w:r>
+              <w:rPr>
+                <w:rFonts w:asciiTheme="minorHAnsi" w:hAnsiTheme="minorHAnsi" w:cstheme="minorHAnsi"/>
+                <w:b/>
+                <w:bCs/>
+                <w:sz w:val="20"/>
+                <w:szCs w:val="20"/>
+              </w:rPr>
+              <w:t>{thicknessDetail}</w:t>
             </w:r>
             <w:r>
               <w:rPr>
@@ -1800,7 +1413,6 @@
               </w:rPr>
               <w:t>{#</w:t>
             </w:r>
-            <w:proofErr w:type="spellStart"/>
             <w:r>
               <w:rPr>
                 <w:rFonts w:asciiTheme="minorHAnsi" w:hAnsiTheme="minorHAnsi" w:cstheme="minorHAnsi"/>
@@ -1812,7 +1424,6 @@
               </w:rPr>
               <w:t>extNotes</w:t>
             </w:r>
-            <w:proofErr w:type="spellEnd"/>
             <w:r>
               <w:rPr>
                 <w:rFonts w:asciiTheme="minorHAnsi" w:hAnsiTheme="minorHAnsi" w:cstheme="minorHAnsi"/>
@@ -1823,7 +1434,6 @@
               </w:rPr>
               <w:t>} - {</w:t>
             </w:r>
-            <w:proofErr w:type="spellStart"/>
             <w:r>
               <w:rPr>
                 <w:rFonts w:asciiTheme="minorHAnsi" w:hAnsiTheme="minorHAnsi" w:cstheme="minorHAnsi"/>
@@ -1835,7 +1445,6 @@
               </w:rPr>
               <w:t>extNotes</w:t>
             </w:r>
-            <w:proofErr w:type="spellEnd"/>
             <w:r>
               <w:rPr>
                 <w:rFonts w:asciiTheme="minorHAnsi" w:hAnsiTheme="minorHAnsi" w:cstheme="minorHAnsi"/>
@@ -1856,8 +1465,6 @@
               </w:rPr>
               <w:t>/</w:t>
             </w:r>
-            <w:proofErr w:type="spellStart"/>
-            <w:proofErr w:type="gramStart"/>
             <w:r>
               <w:rPr>
                 <w:rFonts w:asciiTheme="minorHAnsi" w:hAnsiTheme="minorHAnsi" w:cstheme="minorHAnsi"/>
@@ -1869,7 +1476,6 @@
               </w:rPr>
               <w:t>extNotes</w:t>
             </w:r>
-            <w:proofErr w:type="spellEnd"/>
             <w:r>
               <w:rPr>
                 <w:rFonts w:asciiTheme="minorHAnsi" w:hAnsiTheme="minorHAnsi" w:cstheme="minorHAnsi"/>
@@ -1898,62 +1504,7 @@
                 <w:sz w:val="20"/>
                 <w:szCs w:val="20"/>
               </w:rPr>
-              <w:t>{</w:t>
-            </w:r>
-            <w:proofErr w:type="gramEnd"/>
-            <w:r>
-              <w:rPr>
-                <w:rFonts w:asciiTheme="minorHAnsi" w:hAnsiTheme="minorHAnsi" w:cstheme="minorHAnsi"/>
-                <w:b/>
-                <w:bCs/>
-                <w:sz w:val="20"/>
-                <w:szCs w:val="20"/>
-              </w:rPr>
-              <w:t>#fsc} - {</w:t>
-            </w:r>
-            <w:proofErr w:type="spellStart"/>
-            <w:r>
-              <w:rPr>
-                <w:rFonts w:asciiTheme="minorHAnsi" w:hAnsiTheme="minorHAnsi" w:cstheme="minorHAnsi"/>
-                <w:b/>
-                <w:bCs/>
-                <w:sz w:val="20"/>
-                <w:szCs w:val="20"/>
-              </w:rPr>
-              <w:t>fsc</w:t>
-            </w:r>
-            <w:proofErr w:type="spellEnd"/>
-            <w:r>
-              <w:rPr>
-                <w:rFonts w:asciiTheme="minorHAnsi" w:hAnsiTheme="minorHAnsi" w:cstheme="minorHAnsi"/>
-                <w:b/>
-                <w:bCs/>
-                <w:sz w:val="20"/>
-                <w:szCs w:val="20"/>
-              </w:rPr>
-              <w:t>}{/</w:t>
-            </w:r>
-            <w:proofErr w:type="spellStart"/>
-            <w:r>
-              <w:rPr>
-                <w:rFonts w:asciiTheme="minorHAnsi" w:hAnsiTheme="minorHAnsi" w:cstheme="minorHAnsi"/>
-                <w:b/>
-                <w:bCs/>
-                <w:sz w:val="20"/>
-                <w:szCs w:val="20"/>
-              </w:rPr>
-              <w:t>fsc</w:t>
-            </w:r>
-            <w:proofErr w:type="spellEnd"/>
-            <w:r>
-              <w:rPr>
-                <w:rFonts w:asciiTheme="minorHAnsi" w:hAnsiTheme="minorHAnsi" w:cstheme="minorHAnsi"/>
-                <w:b/>
-                <w:bCs/>
-                <w:sz w:val="20"/>
-                <w:szCs w:val="20"/>
-              </w:rPr>
-              <w:t>}</w:t>
+              <w:t>{#fsc} - {fsc}{/fsc}</w:t>
             </w:r>
           </w:p>
         </w:tc>
@@ -1981,61 +1532,7 @@
                 <w:sz w:val="18"/>
                 <w:szCs w:val="18"/>
               </w:rPr>
-              <w:t>{#</w:t>
-            </w:r>
-            <w:proofErr w:type="gramStart"/>
-            <w:r>
-              <w:rPr>
-                <w:rFonts w:ascii="Arial" w:hAnsi="Arial" w:cs="Arial"/>
-                <w:sz w:val="18"/>
-                <w:szCs w:val="18"/>
-              </w:rPr>
-              <w:t>invoices}{</w:t>
-            </w:r>
-            <w:proofErr w:type="gramEnd"/>
-            <w:r>
-              <w:rPr>
-                <w:rFonts w:ascii="Arial" w:hAnsi="Arial" w:cs="Arial"/>
-                <w:sz w:val="18"/>
-                <w:szCs w:val="18"/>
-              </w:rPr>
-              <w:t>prefixCode}\{containerFrom}{#containerTo} - {</w:t>
-            </w:r>
-            <w:proofErr w:type="spellStart"/>
-            <w:r>
-              <w:rPr>
-                <w:rFonts w:ascii="Arial" w:hAnsi="Arial" w:cs="Arial"/>
-                <w:sz w:val="18"/>
-                <w:szCs w:val="18"/>
-              </w:rPr>
-              <w:t>containerTo</w:t>
-            </w:r>
-            <w:proofErr w:type="spellEnd"/>
-            <w:r>
-              <w:rPr>
-                <w:rFonts w:ascii="Arial" w:hAnsi="Arial" w:cs="Arial"/>
-                <w:sz w:val="18"/>
-                <w:szCs w:val="18"/>
-              </w:rPr>
-              <w:t>}{/</w:t>
-            </w:r>
-            <w:proofErr w:type="spellStart"/>
-            <w:r>
-              <w:rPr>
-                <w:rFonts w:ascii="Arial" w:hAnsi="Arial" w:cs="Arial"/>
-                <w:sz w:val="18"/>
-                <w:szCs w:val="18"/>
-              </w:rPr>
-              <w:t>containerTo</w:t>
-            </w:r>
-            <w:proofErr w:type="spellEnd"/>
-            <w:r>
-              <w:rPr>
-                <w:rFonts w:ascii="Arial" w:hAnsi="Arial" w:cs="Arial"/>
-                <w:sz w:val="18"/>
-                <w:szCs w:val="18"/>
-              </w:rPr>
-              <w:t>}</w:t>
+              <w:t>{#invoices}{prefixCode}\{containerFrom}{#containerTo} - {containerTo}{/containerTo}</w:t>
             </w:r>
           </w:p>
         </w:tc>
@@ -2059,25 +1556,7 @@
                 <w:sz w:val="18"/>
                 <w:szCs w:val="18"/>
               </w:rPr>
-              <w:t>{</w:t>
-            </w:r>
-            <w:proofErr w:type="spellStart"/>
-            <w:r>
-              <w:rPr>
-                <w:rFonts w:ascii="Arial" w:hAnsi="Arial" w:cs="Arial"/>
-                <w:sz w:val="18"/>
-                <w:szCs w:val="18"/>
-              </w:rPr>
-              <w:t>materialGrade</w:t>
-            </w:r>
-            <w:proofErr w:type="spellEnd"/>
-            <w:r>
-              <w:rPr>
-                <w:rFonts w:ascii="Arial" w:hAnsi="Arial" w:cs="Arial"/>
-                <w:sz w:val="18"/>
-                <w:szCs w:val="18"/>
-              </w:rPr>
-              <w:t>}</w:t>
+              <w:t>{materialGrade}</w:t>
             </w:r>
           </w:p>
         </w:tc>
@@ -2101,25 +1580,7 @@
                 <w:sz w:val="18"/>
                 <w:szCs w:val="18"/>
               </w:rPr>
-              <w:t>{</w:t>
-            </w:r>
-            <w:proofErr w:type="spellStart"/>
-            <w:r>
-              <w:rPr>
-                <w:rFonts w:ascii="Arial" w:hAnsi="Arial" w:cs="Arial"/>
-                <w:sz w:val="18"/>
-                <w:szCs w:val="18"/>
-              </w:rPr>
-              <w:t>brandName</w:t>
-            </w:r>
-            <w:proofErr w:type="spellEnd"/>
-            <w:r>
-              <w:rPr>
-                <w:rFonts w:ascii="Arial" w:hAnsi="Arial" w:cs="Arial"/>
-                <w:sz w:val="18"/>
-                <w:szCs w:val="18"/>
-              </w:rPr>
-              <w:t>}</w:t>
+              <w:t>{brandName}</w:t>
             </w:r>
           </w:p>
         </w:tc>
@@ -2145,25 +1606,7 @@
                 <w:sz w:val="18"/>
                 <w:szCs w:val="18"/>
               </w:rPr>
-              <w:t>{</w:t>
-            </w:r>
-            <w:proofErr w:type="spellStart"/>
-            <w:r>
-              <w:rPr>
-                <w:rFonts w:ascii="Arial" w:hAnsi="Arial" w:cs="Arial"/>
-                <w:sz w:val="18"/>
-                <w:szCs w:val="18"/>
-              </w:rPr>
-              <w:t>designType</w:t>
-            </w:r>
-            <w:proofErr w:type="spellEnd"/>
-            <w:r>
-              <w:rPr>
-                <w:rFonts w:ascii="Arial" w:hAnsi="Arial" w:cs="Arial"/>
-                <w:sz w:val="18"/>
-                <w:szCs w:val="18"/>
-              </w:rPr>
-              <w:t>}</w:t>
+              <w:t>{designType}</w:t>
             </w:r>
           </w:p>
         </w:tc>
@@ -2187,25 +1630,7 @@
                 <w:sz w:val="18"/>
                 <w:szCs w:val="18"/>
               </w:rPr>
-              <w:t>{</w:t>
-            </w:r>
-            <w:proofErr w:type="spellStart"/>
-            <w:r>
-              <w:rPr>
-                <w:rFonts w:ascii="Arial" w:hAnsi="Arial" w:cs="Arial"/>
-                <w:sz w:val="18"/>
-                <w:szCs w:val="18"/>
-              </w:rPr>
-              <w:t>finishType</w:t>
-            </w:r>
-            <w:proofErr w:type="spellEnd"/>
-            <w:r>
-              <w:rPr>
-                <w:rFonts w:ascii="Arial" w:hAnsi="Arial" w:cs="Arial"/>
-                <w:sz w:val="18"/>
-                <w:szCs w:val="18"/>
-              </w:rPr>
-              <w:t>}</w:t>
+              <w:t>{finishType}</w:t>
             </w:r>
           </w:p>
         </w:tc>
@@ -2279,27 +1704,8 @@
                 <w:sz w:val="18"/>
                 <w:szCs w:val="18"/>
               </w:rPr>
-              <w:t>{value}{/</w:t>
-            </w:r>
-            <w:proofErr w:type="gramStart"/>
-            <w:r>
-              <w:rPr>
-                <w:rFonts w:ascii="Arial" w:hAnsi="Arial" w:cs="Arial"/>
-                <w:sz w:val="18"/>
-                <w:szCs w:val="18"/>
-              </w:rPr>
-              <w:t>invoices}{</w:t>
-            </w:r>
-            <w:proofErr w:type="gramEnd"/>
-            <w:r>
-              <w:rPr>
-                <w:rFonts w:ascii="Arial" w:hAnsi="Arial" w:cs="Arial"/>
-                <w:sz w:val="18"/>
-                <w:szCs w:val="18"/>
-              </w:rPr>
-              <w:t>/</w:t>
-            </w:r>
-            <w:proofErr w:type="spellStart"/>
+              <w:t>{value}{/invoices}{/</w:t>
+            </w:r>
             <w:r>
               <w:rPr>
                 <w:rFonts w:ascii="Arial" w:hAnsi="Arial" w:cs="Arial"/>
@@ -2308,7 +1714,6 @@
               </w:rPr>
               <w:t>OCItems</w:t>
             </w:r>
-            <w:proofErr w:type="spellEnd"/>
             <w:r>
               <w:rPr>
                 <w:rFonts w:ascii="Arial" w:hAnsi="Arial" w:cs="Arial"/>
@@ -2438,25 +1843,7 @@
                 <w:sz w:val="20"/>
                 <w:szCs w:val="20"/>
               </w:rPr>
-              <w:t>{/</w:t>
-            </w:r>
-            <w:proofErr w:type="spellStart"/>
-            <w:r>
-              <w:rPr>
-                <w:rFonts w:cstheme="minorHAnsi"/>
-                <w:sz w:val="20"/>
-                <w:szCs w:val="20"/>
-              </w:rPr>
-              <w:t>isSampleBox</w:t>
-            </w:r>
-            <w:proofErr w:type="spellEnd"/>
-            <w:r>
-              <w:rPr>
-                <w:rFonts w:cstheme="minorHAnsi"/>
-                <w:sz w:val="20"/>
-                <w:szCs w:val="20"/>
-              </w:rPr>
-              <w:t>}</w:t>
+              <w:t>{/isSampleBox}</w:t>
             </w:r>
           </w:p>
         </w:tc>
@@ -2550,77 +1937,23 @@
                 <w:sz w:val="18"/>
                 <w:szCs w:val="18"/>
               </w:rPr>
-              <w:t>{#</w:t>
-            </w:r>
-            <w:proofErr w:type="gramStart"/>
-            <w:r>
-              <w:rPr>
-                <w:rFonts w:ascii="Arial" w:hAnsi="Arial" w:cs="Arial"/>
-                <w:sz w:val="18"/>
-                <w:szCs w:val="18"/>
-              </w:rPr>
-              <w:t>sampleBox}</w:t>
-            </w:r>
-            <w:r>
-              <w:rPr>
-                <w:rFonts w:ascii="Arial" w:hAnsi="Arial" w:cs="Arial"/>
-                <w:sz w:val="18"/>
-                <w:szCs w:val="18"/>
-              </w:rPr>
-              <w:t>{</w:t>
-            </w:r>
-            <w:proofErr w:type="gramEnd"/>
-            <w:r>
-              <w:rPr>
-                <w:rFonts w:ascii="Arial" w:hAnsi="Arial" w:cs="Arial"/>
-                <w:sz w:val="18"/>
-                <w:szCs w:val="18"/>
-              </w:rPr>
-              <w:t>prefixCode}\</w:t>
-            </w:r>
-            <w:r>
-              <w:rPr>
-                <w:rFonts w:ascii="Arial" w:hAnsi="Arial" w:cs="Arial"/>
-                <w:sz w:val="18"/>
-                <w:szCs w:val="18"/>
-              </w:rPr>
-              <w:t>{containerFrom}{#containerTo} to {</w:t>
-            </w:r>
-            <w:proofErr w:type="spellStart"/>
-            <w:r>
-              <w:rPr>
-                <w:rFonts w:ascii="Arial" w:hAnsi="Arial" w:cs="Arial"/>
-                <w:sz w:val="18"/>
-                <w:szCs w:val="18"/>
-              </w:rPr>
-              <w:t>containerTo</w:t>
-            </w:r>
-            <w:proofErr w:type="spellEnd"/>
-            <w:r>
-              <w:rPr>
-                <w:rFonts w:ascii="Arial" w:hAnsi="Arial" w:cs="Arial"/>
-                <w:sz w:val="18"/>
-                <w:szCs w:val="18"/>
-              </w:rPr>
-              <w:t>} {/</w:t>
-            </w:r>
-            <w:proofErr w:type="spellStart"/>
-            <w:r>
-              <w:rPr>
-                <w:rFonts w:ascii="Arial" w:hAnsi="Arial" w:cs="Arial"/>
-                <w:sz w:val="18"/>
-                <w:szCs w:val="18"/>
-              </w:rPr>
-              <w:t>containerTo</w:t>
-            </w:r>
-            <w:proofErr w:type="spellEnd"/>
-            <w:r>
-              <w:rPr>
-                <w:rFonts w:ascii="Arial" w:hAnsi="Arial" w:cs="Arial"/>
-                <w:sz w:val="18"/>
-                <w:szCs w:val="18"/>
-              </w:rPr>
-              <w:t>}</w:t>
+              <w:t>{#sampleBox}</w:t>
+            </w:r>
+            <w:r>
+              <w:rPr>
+                <w:rFonts w:ascii="Arial" w:hAnsi="Arial" w:cs="Arial"/>
+                <w:sz w:val="18"/>
+                <w:szCs w:val="18"/>
+              </w:rPr>
+              <w:t>{prefixCode}\</w:t>
+            </w:r>
+            <w:r>
+              <w:rPr>
+                <w:rFonts w:ascii="Arial" w:hAnsi="Arial" w:cs="Arial"/>
+                <w:sz w:val="18"/>
+                <w:szCs w:val="18"/>
+              </w:rPr>
+              <w:t>{containerFrom}{#containerTo} to {containerTo} {/containerTo}</w:t>
             </w:r>
           </w:p>
         </w:tc>
@@ -2645,81 +1978,7 @@
                 <w:sz w:val="18"/>
                 <w:szCs w:val="18"/>
               </w:rPr>
-              <w:t>{</w:t>
-            </w:r>
-            <w:proofErr w:type="spellStart"/>
-            <w:proofErr w:type="gramStart"/>
-            <w:r>
-              <w:rPr>
-                <w:rFonts w:ascii="Arial" w:hAnsi="Arial" w:cs="Arial"/>
-                <w:sz w:val="18"/>
-                <w:szCs w:val="18"/>
-              </w:rPr>
-              <w:t>materialGrade</w:t>
-            </w:r>
-            <w:proofErr w:type="spellEnd"/>
-            <w:r>
-              <w:rPr>
-                <w:rFonts w:ascii="Arial" w:hAnsi="Arial" w:cs="Arial"/>
-                <w:sz w:val="18"/>
-                <w:szCs w:val="18"/>
-              </w:rPr>
-              <w:t>}  {</w:t>
-            </w:r>
-            <w:proofErr w:type="spellStart"/>
-            <w:r>
-              <w:rPr>
-                <w:rFonts w:ascii="Arial" w:hAnsi="Arial" w:cs="Arial"/>
-                <w:sz w:val="18"/>
-                <w:szCs w:val="18"/>
-              </w:rPr>
-              <w:t>brandName</w:t>
-            </w:r>
-            <w:proofErr w:type="spellEnd"/>
-            <w:r>
-              <w:rPr>
-                <w:rFonts w:ascii="Arial" w:hAnsi="Arial" w:cs="Arial"/>
-                <w:sz w:val="18"/>
-                <w:szCs w:val="18"/>
-              </w:rPr>
-              <w:t>}  {</w:t>
-            </w:r>
-            <w:proofErr w:type="spellStart"/>
-            <w:r>
-              <w:rPr>
-                <w:rFonts w:ascii="Arial" w:hAnsi="Arial" w:cs="Arial"/>
-                <w:sz w:val="18"/>
-                <w:szCs w:val="18"/>
-              </w:rPr>
-              <w:t>designType</w:t>
-            </w:r>
-            <w:proofErr w:type="spellEnd"/>
-            <w:r>
-              <w:rPr>
-                <w:rFonts w:ascii="Arial" w:hAnsi="Arial" w:cs="Arial"/>
-                <w:sz w:val="18"/>
-                <w:szCs w:val="18"/>
-              </w:rPr>
-              <w:t>}  {</w:t>
-            </w:r>
-            <w:proofErr w:type="spellStart"/>
-            <w:proofErr w:type="gramEnd"/>
-            <w:r>
-              <w:rPr>
-                <w:rFonts w:ascii="Arial" w:hAnsi="Arial" w:cs="Arial"/>
-                <w:sz w:val="18"/>
-                <w:szCs w:val="18"/>
-              </w:rPr>
-              <w:t>finishType</w:t>
-            </w:r>
-            <w:proofErr w:type="spellEnd"/>
-            <w:r>
-              <w:rPr>
-                <w:rFonts w:ascii="Arial" w:hAnsi="Arial" w:cs="Arial"/>
-                <w:sz w:val="18"/>
-                <w:szCs w:val="18"/>
-              </w:rPr>
-              <w:t>}</w:t>
+              <w:t>{materialGrade}  {brandName}  {designType}  {finishType}</w:t>
             </w:r>
           </w:p>
         </w:tc>
@@ -2801,25 +2060,7 @@
                 <w:sz w:val="18"/>
                 <w:szCs w:val="18"/>
               </w:rPr>
-              <w:t>value}{/</w:t>
-            </w:r>
-            <w:proofErr w:type="spellStart"/>
-            <w:r>
-              <w:rPr>
-                <w:rFonts w:ascii="Arial" w:hAnsi="Arial" w:cs="Arial"/>
-                <w:sz w:val="18"/>
-                <w:szCs w:val="18"/>
-              </w:rPr>
-              <w:t>sampleBox</w:t>
-            </w:r>
-            <w:proofErr w:type="spellEnd"/>
-            <w:r>
-              <w:rPr>
-                <w:rFonts w:ascii="Arial" w:hAnsi="Arial" w:cs="Arial"/>
-                <w:sz w:val="18"/>
-                <w:szCs w:val="18"/>
-              </w:rPr>
-              <w:t>}</w:t>
+              <w:t>value}{/sampleBox}</w:t>
             </w:r>
           </w:p>
         </w:tc>
@@ -3068,29 +2309,7 @@
                 <w:sz w:val="18"/>
                 <w:szCs w:val="18"/>
               </w:rPr>
-              <w:t>{</w:t>
-            </w:r>
-            <w:proofErr w:type="spellStart"/>
-            <w:r>
-              <w:rPr>
-                <w:rFonts w:ascii="Arial" w:hAnsi="Arial" w:cs="Arial"/>
-                <w:b/>
-                <w:bCs/>
-                <w:sz w:val="18"/>
-                <w:szCs w:val="18"/>
-              </w:rPr>
-              <w:t>totalQuantity</w:t>
-            </w:r>
-            <w:proofErr w:type="spellEnd"/>
-            <w:r>
-              <w:rPr>
-                <w:rFonts w:ascii="Arial" w:hAnsi="Arial" w:cs="Arial"/>
-                <w:b/>
-                <w:bCs/>
-                <w:sz w:val="18"/>
-                <w:szCs w:val="18"/>
-              </w:rPr>
-              <w:t>}</w:t>
+              <w:t>{totalQuantity}</w:t>
             </w:r>
           </w:p>
         </w:tc>
@@ -3134,29 +2353,7 @@
                 <w:sz w:val="18"/>
                 <w:szCs w:val="18"/>
               </w:rPr>
-              <w:t>{</w:t>
-            </w:r>
-            <w:proofErr w:type="spellStart"/>
-            <w:r>
-              <w:rPr>
-                <w:rFonts w:ascii="Arial" w:hAnsi="Arial" w:cs="Arial"/>
-                <w:b/>
-                <w:bCs/>
-                <w:sz w:val="18"/>
-                <w:szCs w:val="18"/>
-              </w:rPr>
-              <w:t>totalAmount</w:t>
-            </w:r>
-            <w:proofErr w:type="spellEnd"/>
-            <w:r>
-              <w:rPr>
-                <w:rFonts w:ascii="Arial" w:hAnsi="Arial" w:cs="Arial"/>
-                <w:b/>
-                <w:bCs/>
-                <w:sz w:val="18"/>
-                <w:szCs w:val="18"/>
-              </w:rPr>
-              <w:t>}</w:t>
+              <w:t>{totalAmount}</w:t>
             </w:r>
           </w:p>
         </w:tc>
@@ -3457,6 +2654,16 @@
               </w:rPr>
               <w:t>Addition</w:t>
             </w:r>
+            <w:r>
+              <w:rPr>
+                <w:rFonts w:ascii="Arial" w:hAnsi="Arial" w:cs="Arial"/>
+                <w:b/>
+                <w:bCs/>
+                <w:sz w:val="18"/>
+                <w:szCs w:val="18"/>
+              </w:rPr>
+              <w:t xml:space="preserve"> – Sea Freight</w:t>
+            </w:r>
           </w:p>
         </w:tc>
         <w:tc>
@@ -3473,6 +2680,14 @@
                 <w:szCs w:val="18"/>
               </w:rPr>
             </w:pPr>
+            <w:r>
+              <w:rPr>
+                <w:rFonts w:ascii="Arial" w:hAnsi="Arial" w:cs="Arial"/>
+                <w:sz w:val="18"/>
+                <w:szCs w:val="18"/>
+              </w:rPr>
+              <w:t>Charges</w:t>
+            </w:r>
           </w:p>
         </w:tc>
         <w:tc>
@@ -3497,25 +2712,7 @@
                 <w:sz w:val="18"/>
                 <w:szCs w:val="18"/>
               </w:rPr>
-              <w:t>{</w:t>
-            </w:r>
-            <w:proofErr w:type="spellStart"/>
-            <w:r>
-              <w:rPr>
-                <w:rFonts w:ascii="Arial" w:hAnsi="Arial" w:cs="Arial"/>
-                <w:sz w:val="18"/>
-                <w:szCs w:val="18"/>
-              </w:rPr>
-              <w:t>totalAddition</w:t>
-            </w:r>
-            <w:proofErr w:type="spellEnd"/>
-            <w:r>
-              <w:rPr>
-                <w:rFonts w:ascii="Arial" w:hAnsi="Arial" w:cs="Arial"/>
-                <w:sz w:val="18"/>
-                <w:szCs w:val="18"/>
-              </w:rPr>
-              <w:t>}</w:t>
+              <w:t>{totalAddition}</w:t>
             </w:r>
           </w:p>
         </w:tc>
@@ -3654,25 +2851,7 @@
                 <w:sz w:val="18"/>
                 <w:szCs w:val="18"/>
               </w:rPr>
-              <w:t>{</w:t>
-            </w:r>
-            <w:proofErr w:type="spellStart"/>
-            <w:r>
-              <w:rPr>
-                <w:rFonts w:ascii="Arial" w:hAnsi="Arial" w:cs="Arial"/>
-                <w:sz w:val="18"/>
-                <w:szCs w:val="18"/>
-              </w:rPr>
-              <w:t>totalDiscount</w:t>
-            </w:r>
-            <w:proofErr w:type="spellEnd"/>
-            <w:r>
-              <w:rPr>
-                <w:rFonts w:ascii="Arial" w:hAnsi="Arial" w:cs="Arial"/>
-                <w:sz w:val="18"/>
-                <w:szCs w:val="18"/>
-              </w:rPr>
-              <w:t>}</w:t>
+              <w:t>{totalDiscount}</w:t>
             </w:r>
           </w:p>
         </w:tc>
@@ -3876,7 +3055,6 @@
               </w:rPr>
               <w:t>Total {</w:t>
             </w:r>
-            <w:proofErr w:type="spellStart"/>
             <w:r>
               <w:rPr>
                 <w:rFonts w:ascii="Arial" w:hAnsi="Arial" w:cs="Arial"/>
@@ -3888,7 +3066,6 @@
               </w:rPr>
               <w:t>deliveryTerms</w:t>
             </w:r>
-            <w:proofErr w:type="spellEnd"/>
             <w:r>
               <w:rPr>
                 <w:rFonts w:ascii="Arial" w:hAnsi="Arial" w:cs="Arial"/>
@@ -3899,8 +3076,6 @@
               </w:rPr>
               <w:t>} {</w:t>
             </w:r>
-            <w:proofErr w:type="spellStart"/>
-            <w:proofErr w:type="gramStart"/>
             <w:r>
               <w:rPr>
                 <w:rFonts w:ascii="Arial" w:hAnsi="Arial" w:cs="Arial"/>
@@ -3912,7 +3087,6 @@
               </w:rPr>
               <w:t>dischargeTerms</w:t>
             </w:r>
-            <w:proofErr w:type="spellEnd"/>
             <w:r>
               <w:rPr>
                 <w:rFonts w:ascii="Arial" w:hAnsi="Arial" w:cs="Arial"/>
@@ -3939,52 +3113,7 @@
                 <w:sz w:val="18"/>
                 <w:szCs w:val="18"/>
               </w:rPr>
-              <w:t>{</w:t>
-            </w:r>
-            <w:proofErr w:type="spellStart"/>
-            <w:proofErr w:type="gramEnd"/>
-            <w:r>
-              <w:rPr>
-                <w:rFonts w:ascii="Arial" w:hAnsi="Arial" w:cs="Arial"/>
-                <w:b/>
-                <w:bCs/>
-                <w:sz w:val="18"/>
-                <w:szCs w:val="18"/>
-              </w:rPr>
-              <w:t>currencyChar</w:t>
-            </w:r>
-            <w:proofErr w:type="spellEnd"/>
-            <w:r>
-              <w:rPr>
-                <w:rFonts w:ascii="Arial" w:hAnsi="Arial" w:cs="Arial"/>
-                <w:b/>
-                <w:bCs/>
-                <w:sz w:val="18"/>
-                <w:szCs w:val="18"/>
-              </w:rPr>
-              <w:t>} {</w:t>
-            </w:r>
-            <w:proofErr w:type="spellStart"/>
-            <w:r>
-              <w:rPr>
-                <w:rFonts w:ascii="Arial" w:hAnsi="Arial" w:cs="Arial"/>
-                <w:b/>
-                <w:bCs/>
-                <w:sz w:val="18"/>
-                <w:szCs w:val="18"/>
-              </w:rPr>
-              <w:t>netAmountWords</w:t>
-            </w:r>
-            <w:proofErr w:type="spellEnd"/>
-            <w:r>
-              <w:rPr>
-                <w:rFonts w:ascii="Arial" w:hAnsi="Arial" w:cs="Arial"/>
-                <w:b/>
-                <w:bCs/>
-                <w:sz w:val="18"/>
-                <w:szCs w:val="18"/>
-              </w:rPr>
-              <w:t>} Only</w:t>
+              <w:t>{currencyChar} {netAmountWords} Only</w:t>
             </w:r>
           </w:p>
         </w:tc>
@@ -4025,25 +3154,7 @@
                 <w:sz w:val="18"/>
                 <w:szCs w:val="18"/>
               </w:rPr>
-              <w:t>{</w:t>
-            </w:r>
-            <w:proofErr w:type="spellStart"/>
-            <w:r>
-              <w:rPr>
-                <w:rFonts w:ascii="Arial" w:hAnsi="Arial" w:cs="Arial"/>
-                <w:sz w:val="18"/>
-                <w:szCs w:val="18"/>
-              </w:rPr>
-              <w:t>netAmount</w:t>
-            </w:r>
-            <w:proofErr w:type="spellEnd"/>
-            <w:r>
-              <w:rPr>
-                <w:rFonts w:ascii="Arial" w:hAnsi="Arial" w:cs="Arial"/>
-                <w:sz w:val="18"/>
-                <w:szCs w:val="18"/>
-              </w:rPr>
-              <w:t>}</w:t>
+              <w:t>{netAmount}</w:t>
             </w:r>
           </w:p>
         </w:tc>
@@ -4132,7 +3243,6 @@
               </w:rPr>
               <w:t>{</w:t>
             </w:r>
-            <w:proofErr w:type="spellStart"/>
             <w:r>
               <w:rPr>
                 <w:rFonts w:ascii="Arial" w:hAnsi="Arial" w:cs="Arial"/>
@@ -4142,7 +3252,6 @@
               </w:rPr>
               <w:t>deliveryDetails</w:t>
             </w:r>
-            <w:proofErr w:type="spellEnd"/>
             <w:r>
               <w:rPr>
                 <w:rFonts w:ascii="Arial" w:hAnsi="Arial" w:cs="Arial"/>
@@ -4236,25 +3345,7 @@
                 <w:sz w:val="18"/>
                 <w:szCs w:val="18"/>
               </w:rPr>
-              <w:t>{</w:t>
-            </w:r>
-            <w:proofErr w:type="spellStart"/>
-            <w:r>
-              <w:rPr>
-                <w:rFonts w:ascii="Arial" w:hAnsi="Arial" w:cs="Arial"/>
-                <w:sz w:val="18"/>
-                <w:szCs w:val="18"/>
-              </w:rPr>
-              <w:t>bNameOC</w:t>
-            </w:r>
-            <w:proofErr w:type="spellEnd"/>
-            <w:r>
-              <w:rPr>
-                <w:rFonts w:ascii="Arial" w:hAnsi="Arial" w:cs="Arial"/>
-                <w:sz w:val="18"/>
-                <w:szCs w:val="18"/>
-              </w:rPr>
-              <w:t xml:space="preserve">} </w:t>
+              <w:t xml:space="preserve">{bNameOC} </w:t>
             </w:r>
           </w:p>
           <w:p>
@@ -4272,43 +3363,7 @@
                 <w:sz w:val="18"/>
                 <w:szCs w:val="18"/>
               </w:rPr>
-              <w:t>{#</w:t>
-            </w:r>
-            <w:proofErr w:type="gramStart"/>
-            <w:r>
-              <w:rPr>
-                <w:rFonts w:ascii="Arial" w:hAnsi="Arial" w:cs="Arial"/>
-                <w:sz w:val="18"/>
-                <w:szCs w:val="18"/>
-              </w:rPr>
-              <w:t>bBranchOC}{</w:t>
-            </w:r>
-            <w:proofErr w:type="gramEnd"/>
-            <w:r>
-              <w:rPr>
-                <w:rFonts w:ascii="Arial" w:hAnsi="Arial" w:cs="Arial"/>
-                <w:sz w:val="18"/>
-                <w:szCs w:val="18"/>
-              </w:rPr>
-              <w:t>bBranchOC} BRANCH{/</w:t>
-            </w:r>
-            <w:proofErr w:type="spellStart"/>
-            <w:r>
-              <w:rPr>
-                <w:rFonts w:ascii="Arial" w:hAnsi="Arial" w:cs="Arial"/>
-                <w:sz w:val="18"/>
-                <w:szCs w:val="18"/>
-              </w:rPr>
-              <w:t>bBranchOC</w:t>
-            </w:r>
-            <w:proofErr w:type="spellEnd"/>
-            <w:r>
-              <w:rPr>
-                <w:rFonts w:ascii="Arial" w:hAnsi="Arial" w:cs="Arial"/>
-                <w:sz w:val="18"/>
-                <w:szCs w:val="18"/>
-              </w:rPr>
-              <w:t>}</w:t>
+              <w:t>{#bBranchOC}{bBranchOC} BRANCH{/bBranchOC}</w:t>
             </w:r>
           </w:p>
           <w:p>
@@ -4326,43 +3381,7 @@
                 <w:sz w:val="18"/>
                 <w:szCs w:val="18"/>
               </w:rPr>
-              <w:t>{</w:t>
-            </w:r>
-            <w:proofErr w:type="spellStart"/>
-            <w:r>
-              <w:rPr>
-                <w:rFonts w:ascii="Arial" w:hAnsi="Arial" w:cs="Arial"/>
-                <w:sz w:val="18"/>
-                <w:szCs w:val="18"/>
-              </w:rPr>
-              <w:t>bAddressOC</w:t>
-            </w:r>
-            <w:proofErr w:type="spellEnd"/>
-            <w:r>
-              <w:rPr>
-                <w:rFonts w:ascii="Arial" w:hAnsi="Arial" w:cs="Arial"/>
-                <w:sz w:val="18"/>
-                <w:szCs w:val="18"/>
-              </w:rPr>
-              <w:t>}{</w:t>
-            </w:r>
-            <w:proofErr w:type="spellStart"/>
-            <w:r>
-              <w:rPr>
-                <w:rFonts w:ascii="Arial" w:hAnsi="Arial" w:cs="Arial"/>
-                <w:sz w:val="18"/>
-                <w:szCs w:val="18"/>
-              </w:rPr>
-              <w:t>bCityOC</w:t>
-            </w:r>
-            <w:proofErr w:type="spellEnd"/>
-            <w:r>
-              <w:rPr>
-                <w:rFonts w:ascii="Arial" w:hAnsi="Arial" w:cs="Arial"/>
-                <w:sz w:val="18"/>
-                <w:szCs w:val="18"/>
-              </w:rPr>
-              <w:t>}</w:t>
+              <w:t>{bAddressOC}{bCityOC}</w:t>
             </w:r>
           </w:p>
           <w:p>
@@ -4380,43 +3399,7 @@
                 <w:sz w:val="18"/>
                 <w:szCs w:val="18"/>
               </w:rPr>
-              <w:t>{#swiftNumberOC}SWIFT – {</w:t>
-            </w:r>
-            <w:proofErr w:type="spellStart"/>
-            <w:r>
-              <w:rPr>
-                <w:rFonts w:ascii="Arial" w:hAnsi="Arial" w:cs="Arial"/>
-                <w:sz w:val="18"/>
-                <w:szCs w:val="18"/>
-              </w:rPr>
-              <w:t>swiftNumberOC</w:t>
-            </w:r>
-            <w:proofErr w:type="spellEnd"/>
-            <w:r>
-              <w:rPr>
-                <w:rFonts w:ascii="Arial" w:hAnsi="Arial" w:cs="Arial"/>
-                <w:sz w:val="18"/>
-                <w:szCs w:val="18"/>
-              </w:rPr>
-              <w:t>}{/</w:t>
-            </w:r>
-            <w:proofErr w:type="spellStart"/>
-            <w:r>
-              <w:rPr>
-                <w:rFonts w:ascii="Arial" w:hAnsi="Arial" w:cs="Arial"/>
-                <w:sz w:val="18"/>
-                <w:szCs w:val="18"/>
-              </w:rPr>
-              <w:t>swiftNumberOC</w:t>
-            </w:r>
-            <w:proofErr w:type="spellEnd"/>
-            <w:r>
-              <w:rPr>
-                <w:rFonts w:ascii="Arial" w:hAnsi="Arial" w:cs="Arial"/>
-                <w:sz w:val="18"/>
-                <w:szCs w:val="18"/>
-              </w:rPr>
-              <w:t>}</w:t>
+              <w:t>{#swiftNumberOC}SWIFT – {swiftNumberOC}{/swiftNumberOC}</w:t>
             </w:r>
           </w:p>
         </w:tc>
@@ -4472,19 +3455,8 @@
                 <w:szCs w:val="18"/>
                 <w:lang w:val="en-IN"/>
               </w:rPr>
-              <w:t>{</w:t>
-            </w:r>
-            <w:proofErr w:type="spellStart"/>
-            <w:r>
-              <w:rPr>
-                <w:rFonts w:ascii="Arial" w:hAnsi="Arial" w:cs="Arial"/>
-                <w:sz w:val="18"/>
-                <w:szCs w:val="18"/>
-                <w:lang w:val="en-IN"/>
-              </w:rPr>
-              <w:t>shippingDetails</w:t>
-            </w:r>
-            <w:proofErr w:type="spellEnd"/>
+              <w:t>{shippingDetails</w:t>
+            </w:r>
             <w:r>
               <w:rPr>
                 <w:rFonts w:ascii="Arial" w:hAnsi="Arial" w:cs="Arial"/>
@@ -4601,7 +3573,6 @@
               </w:rPr>
               <w:t>{</w:t>
             </w:r>
-            <w:proofErr w:type="spellStart"/>
             <w:r>
               <w:rPr>
                 <w:rFonts w:ascii="Arial" w:hAnsi="Arial" w:cs="Arial"/>
@@ -4609,17 +3580,7 @@
                 <w:szCs w:val="18"/>
                 <w:lang w:val="en-IN"/>
               </w:rPr>
-              <w:t>paymentTerms</w:t>
-            </w:r>
-            <w:proofErr w:type="spellEnd"/>
-            <w:r>
-              <w:rPr>
-                <w:rFonts w:ascii="Arial" w:hAnsi="Arial" w:cs="Arial"/>
-                <w:sz w:val="18"/>
-                <w:szCs w:val="18"/>
-                <w:lang w:val="en-IN"/>
-              </w:rPr>
-              <w:t>}</w:t>
+              <w:t>paymentTerms}</w:t>
             </w:r>
           </w:p>
         </w:tc>
@@ -4855,25 +3816,7 @@
                 <w:sz w:val="18"/>
                 <w:szCs w:val="18"/>
               </w:rPr>
-              <w:t>{.}{/</w:t>
-            </w:r>
-            <w:proofErr w:type="spellStart"/>
-            <w:r>
-              <w:rPr>
-                <w:rFonts w:asciiTheme="minorHAnsi" w:hAnsiTheme="minorHAnsi" w:cstheme="minorHAnsi"/>
-                <w:sz w:val="18"/>
-                <w:szCs w:val="18"/>
-              </w:rPr>
-              <w:t>invoiceInstructions</w:t>
-            </w:r>
-            <w:proofErr w:type="spellEnd"/>
-            <w:r>
-              <w:rPr>
-                <w:rFonts w:asciiTheme="minorHAnsi" w:hAnsiTheme="minorHAnsi" w:cstheme="minorHAnsi"/>
-                <w:sz w:val="18"/>
-                <w:szCs w:val="18"/>
-              </w:rPr>
-              <w:t>}</w:t>
+              <w:t>{.}{/invoiceInstructions}</w:t>
             </w:r>
           </w:p>
         </w:tc>
@@ -4949,7 +3892,6 @@
       </w:rPr>
       <w:t>{#</w:t>
     </w:r>
-    <w:proofErr w:type="gramStart"/>
     <w:r>
       <w:rPr>
         <w:lang w:val="en-IN"/>
@@ -4967,15 +3909,7 @@
         <w:spacing w:val="100"/>
         <w:lang w:val="en-IN"/>
       </w:rPr>
-      <w:t>{</w:t>
-    </w:r>
-    <w:proofErr w:type="gramEnd"/>
-    <w:r>
-      <w:rPr>
-        <w:spacing w:val="100"/>
-        <w:lang w:val="en-IN"/>
-      </w:rPr>
-      <w:t>companyName}</w:t>
+      <w:t>{companyName}</w:t>
     </w:r>
   </w:p>
   <w:p>
@@ -4996,13 +3930,8 @@
       <w:t xml:space="preserve">                                     </w:t>
     </w:r>
     <w:r>
-      <w:t>{</w:t>
+      <w:t>{signPerson</w:t>
     </w:r>
-    <w:proofErr w:type="spellStart"/>
-    <w:r>
-      <w:t>signPerson</w:t>
-    </w:r>
-    <w:proofErr w:type="spellEnd"/>
     <w:r>
       <w:t>}</w:t>
     </w:r>
@@ -5020,14 +3949,12 @@
       </w:rPr>
       <w:t>/</w:t>
     </w:r>
-    <w:proofErr w:type="spellStart"/>
     <w:r>
       <w:rPr>
         <w:lang w:val="en-IN"/>
       </w:rPr>
       <w:t>companyData</w:t>
     </w:r>
-    <w:proofErr w:type="spellEnd"/>
     <w:r>
       <w:rPr>
         <w:lang w:val="en-IN"/>
@@ -5084,7 +4011,6 @@
       </w:rPr>
       <w:t>{#</w:t>
     </w:r>
-    <w:proofErr w:type="gramStart"/>
     <w:r>
       <w:rPr>
         <w:lang w:val="en-IN"/>
@@ -5109,8 +4035,6 @@
       </w:rPr>
       <w:t>{</w:t>
     </w:r>
-    <w:proofErr w:type="spellStart"/>
-    <w:proofErr w:type="gramEnd"/>
     <w:r>
       <w:rPr>
         <w:rFonts w:ascii="Arial" w:hAnsi="Arial" w:cs="Arial"/>
@@ -5122,7 +4046,6 @@
       </w:rPr>
       <w:t>companyName</w:t>
     </w:r>
-    <w:proofErr w:type="spellEnd"/>
     <w:r>
       <w:rPr>
         <w:rFonts w:ascii="Arial" w:hAnsi="Arial" w:cs="Arial"/>
@@ -5166,7 +4089,6 @@
       </w:rPr>
       <w:t>companyAddressLine1</w:t>
     </w:r>
-    <w:proofErr w:type="gramStart"/>
     <w:r>
       <w:rPr>
         <w:rFonts w:ascii="Arial" w:hAnsi="Arial" w:cs="Arial"/>
@@ -5175,7 +4097,6 @@
       </w:rPr>
       <w:t>},  {</w:t>
     </w:r>
-    <w:proofErr w:type="gramEnd"/>
     <w:r>
       <w:rPr>
         <w:rFonts w:ascii="Arial" w:hAnsi="Arial" w:cs="Arial"/>
@@ -5184,7 +4105,6 @@
       </w:rPr>
       <w:t>companyAddressLine2</w:t>
     </w:r>
-    <w:proofErr w:type="gramStart"/>
     <w:r>
       <w:rPr>
         <w:rFonts w:ascii="Arial" w:hAnsi="Arial" w:cs="Arial"/>
@@ -5193,8 +4113,6 @@
       </w:rPr>
       <w:t>},      {</w:t>
     </w:r>
-    <w:proofErr w:type="spellStart"/>
-    <w:proofErr w:type="gramEnd"/>
     <w:r>
       <w:rPr>
         <w:rFonts w:ascii="Arial" w:hAnsi="Arial" w:cs="Arial"/>
@@ -5203,7 +4121,6 @@
       </w:rPr>
       <w:t>companyCity</w:t>
     </w:r>
-    <w:proofErr w:type="spellEnd"/>
     <w:r>
       <w:rPr>
         <w:rFonts w:ascii="Arial" w:hAnsi="Arial" w:cs="Arial"/>
@@ -5212,7 +4129,6 @@
       </w:rPr>
       <w:t>}-{</w:t>
     </w:r>
-    <w:proofErr w:type="spellStart"/>
     <w:r>
       <w:rPr>
         <w:rFonts w:ascii="Arial" w:hAnsi="Arial" w:cs="Arial"/>
@@ -5221,7 +4137,6 @@
       </w:rPr>
       <w:t>companyPostalCode</w:t>
     </w:r>
-    <w:proofErr w:type="spellEnd"/>
     <w:r>
       <w:rPr>
         <w:rFonts w:ascii="Arial" w:hAnsi="Arial" w:cs="Arial"/>
@@ -5256,7 +4171,6 @@
       </w:rPr>
       <w:t>{#</w:t>
     </w:r>
-    <w:proofErr w:type="gramStart"/>
     <w:r>
       <w:rPr>
         <w:rFonts w:ascii="Arial" w:hAnsi="Arial" w:cs="Arial"/>
@@ -5283,17 +4197,7 @@
         <w:sz w:val="20"/>
         <w:szCs w:val="20"/>
       </w:rPr>
-      <w:t>TELEPHONE</w:t>
-    </w:r>
-    <w:proofErr w:type="gramEnd"/>
-    <w:r>
-      <w:rPr>
-        <w:rFonts w:ascii="Arial" w:hAnsi="Arial" w:cs="Arial"/>
-        <w:b/>
-        <w:sz w:val="20"/>
-        <w:szCs w:val="20"/>
-      </w:rPr>
-      <w:t xml:space="preserve"> NO: </w:t>
+      <w:t xml:space="preserve">TELEPHONE NO: </w:t>
     </w:r>
     <w:r>
       <w:rPr>
@@ -5314,7 +4218,6 @@
       </w:rPr>
       <w:t>telephone</w:t>
     </w:r>
-    <w:proofErr w:type="gramStart"/>
     <w:r>
       <w:rPr>
         <w:rFonts w:ascii="Arial" w:hAnsi="Arial" w:cs="Arial"/>
@@ -5322,17 +4225,7 @@
         <w:sz w:val="20"/>
         <w:szCs w:val="20"/>
       </w:rPr>
-      <w:t>}{</w:t>
-    </w:r>
-    <w:proofErr w:type="gramEnd"/>
-    <w:r>
-      <w:rPr>
-        <w:rFonts w:ascii="Arial" w:hAnsi="Arial" w:cs="Arial"/>
-        <w:b/>
-        <w:sz w:val="20"/>
-        <w:szCs w:val="20"/>
-      </w:rPr>
-      <w:t>/}</w:t>
+      <w:t>}{/}</w:t>
     </w:r>
     <w:r>
       <w:rPr>
@@ -5350,19 +4243,8 @@
         <w:sz w:val="20"/>
         <w:szCs w:val="20"/>
       </w:rPr>
-      <w:t>{#</w:t>
+      <w:t xml:space="preserve">{#email}   </w:t>
     </w:r>
-    <w:proofErr w:type="gramStart"/>
-    <w:r>
-      <w:rPr>
-        <w:rFonts w:ascii="Arial" w:hAnsi="Arial" w:cs="Arial"/>
-        <w:b/>
-        <w:sz w:val="20"/>
-        <w:szCs w:val="20"/>
-      </w:rPr>
-      <w:t xml:space="preserve">email}   </w:t>
-    </w:r>
-    <w:proofErr w:type="gramEnd"/>
     <w:r>
       <w:rPr>
         <w:rFonts w:ascii="Arial" w:hAnsi="Arial" w:cs="Arial"/>
@@ -5379,27 +4261,7 @@
         <w:sz w:val="20"/>
         <w:szCs w:val="20"/>
       </w:rPr>
-      <w:t>{email</w:t>
-    </w:r>
-    <w:proofErr w:type="gramStart"/>
-    <w:r>
-      <w:rPr>
-        <w:rFonts w:ascii="Arial" w:hAnsi="Arial" w:cs="Arial"/>
-        <w:b/>
-        <w:sz w:val="20"/>
-        <w:szCs w:val="20"/>
-      </w:rPr>
-      <w:t>}{</w:t>
-    </w:r>
-    <w:proofErr w:type="gramEnd"/>
-    <w:r>
-      <w:rPr>
-        <w:rFonts w:ascii="Arial" w:hAnsi="Arial" w:cs="Arial"/>
-        <w:b/>
-        <w:sz w:val="20"/>
-        <w:szCs w:val="20"/>
-      </w:rPr>
-      <w:t>/}</w:t>
+      <w:t>{email}{/}</w:t>
     </w:r>
     <w:r>
       <w:rPr>
@@ -5417,17 +4279,7 @@
         <w:sz w:val="20"/>
         <w:szCs w:val="20"/>
       </w:rPr>
-      <w:t>{#</w:t>
-    </w:r>
-    <w:proofErr w:type="gramStart"/>
-    <w:r>
-      <w:rPr>
-        <w:rFonts w:ascii="Arial" w:hAnsi="Arial" w:cs="Arial"/>
-        <w:b/>
-        <w:sz w:val="20"/>
-        <w:szCs w:val="20"/>
-      </w:rPr>
-      <w:t>website}</w:t>
+      <w:t>{#website}</w:t>
     </w:r>
     <w:r>
       <w:rPr>
@@ -5447,7 +4299,6 @@
       </w:rPr>
       <w:t xml:space="preserve">  </w:t>
     </w:r>
-    <w:proofErr w:type="gramEnd"/>
     <w:r>
       <w:rPr>
         <w:rFonts w:ascii="Arial" w:hAnsi="Arial" w:cs="Arial"/>
@@ -5464,27 +4315,7 @@
         <w:sz w:val="20"/>
         <w:szCs w:val="20"/>
       </w:rPr>
-      <w:t>{website</w:t>
-    </w:r>
-    <w:proofErr w:type="gramStart"/>
-    <w:r>
-      <w:rPr>
-        <w:rFonts w:ascii="Arial" w:hAnsi="Arial" w:cs="Arial"/>
-        <w:b/>
-        <w:sz w:val="20"/>
-        <w:szCs w:val="20"/>
-      </w:rPr>
-      <w:t>}{</w:t>
-    </w:r>
-    <w:proofErr w:type="gramEnd"/>
-    <w:r>
-      <w:rPr>
-        <w:rFonts w:ascii="Arial" w:hAnsi="Arial" w:cs="Arial"/>
-        <w:b/>
-        <w:sz w:val="20"/>
-        <w:szCs w:val="20"/>
-      </w:rPr>
-      <w:t>/}</w:t>
+      <w:t>{website}{/}</w:t>
     </w:r>
   </w:p>
   <w:p>
@@ -5501,39 +4332,7 @@
         <w:rFonts w:ascii="Arial" w:hAnsi="Arial" w:cs="Arial"/>
         <w:sz w:val="20"/>
       </w:rPr>
-      <w:t>{#</w:t>
-    </w:r>
-    <w:proofErr w:type="gramStart"/>
-    <w:r>
-      <w:rPr>
-        <w:rFonts w:ascii="Arial" w:hAnsi="Arial" w:cs="Arial"/>
-        <w:sz w:val="20"/>
-      </w:rPr>
-      <w:t>remarks}{</w:t>
-    </w:r>
-    <w:proofErr w:type="gramEnd"/>
-    <w:r>
-      <w:rPr>
-        <w:rFonts w:ascii="Arial" w:hAnsi="Arial" w:cs="Arial"/>
-        <w:sz w:val="20"/>
-      </w:rPr>
-      <w:t>remarks</w:t>
-    </w:r>
-    <w:proofErr w:type="gramStart"/>
-    <w:r>
-      <w:rPr>
-        <w:rFonts w:ascii="Arial" w:hAnsi="Arial" w:cs="Arial"/>
-        <w:sz w:val="20"/>
-      </w:rPr>
-      <w:t>}{</w:t>
-    </w:r>
-    <w:proofErr w:type="gramEnd"/>
-    <w:r>
-      <w:rPr>
-        <w:rFonts w:ascii="Arial" w:hAnsi="Arial" w:cs="Arial"/>
-        <w:sz w:val="20"/>
-      </w:rPr>
-      <w:t>/}</w:t>
+      <w:t>{#remarks}{remarks}{/}</w:t>
     </w:r>
   </w:p>
   <w:p>
@@ -5557,16 +4356,7 @@
         <w:spacing w:val="-4"/>
         <w:sz w:val="20"/>
       </w:rPr>
-      <w:t>remark</w:t>
-    </w:r>
-    <w:proofErr w:type="gramStart"/>
-    <w:r>
-      <w:rPr>
-        <w:rFonts w:ascii="Arial" w:hAnsi="Arial" w:cs="Arial"/>
-        <w:spacing w:val="-4"/>
-        <w:sz w:val="20"/>
-      </w:rPr>
-      <w:t>2</w:t>
+      <w:t>remark2</w:t>
     </w:r>
     <w:r>
       <w:rPr>
@@ -5575,38 +4365,20 @@
       </w:rPr>
       <w:t>}{</w:t>
     </w:r>
-    <w:proofErr w:type="gramEnd"/>
     <w:r>
       <w:rPr>
         <w:rFonts w:ascii="Arial" w:hAnsi="Arial" w:cs="Arial"/>
         <w:spacing w:val="-4"/>
         <w:sz w:val="20"/>
       </w:rPr>
-      <w:t>remark</w:t>
-    </w:r>
-    <w:proofErr w:type="gramStart"/>
-    <w:r>
-      <w:rPr>
-        <w:rFonts w:ascii="Arial" w:hAnsi="Arial" w:cs="Arial"/>
-        <w:spacing w:val="-4"/>
-        <w:sz w:val="20"/>
-      </w:rPr>
-      <w:t>2</w:t>
+      <w:t>remark2</w:t>
     </w:r>
     <w:r>
       <w:rPr>
         <w:rFonts w:ascii="Arial" w:hAnsi="Arial" w:cs="Arial"/>
         <w:sz w:val="20"/>
       </w:rPr>
-      <w:t>}{</w:t>
-    </w:r>
-    <w:proofErr w:type="gramEnd"/>
-    <w:r>
-      <w:rPr>
-        <w:rFonts w:ascii="Arial" w:hAnsi="Arial" w:cs="Arial"/>
-        <w:sz w:val="20"/>
-      </w:rPr>
-      <w:t>/}</w:t>
+      <w:t>}{/}</w:t>
     </w:r>
     <w:r>
       <w:rPr>
@@ -5700,14 +4472,12 @@
       </w:rPr>
       <w:t>{/</w:t>
     </w:r>
-    <w:proofErr w:type="spellStart"/>
     <w:r>
       <w:rPr>
         <w:lang w:val="en-IN"/>
       </w:rPr>
       <w:t>companyData</w:t>
     </w:r>
-    <w:proofErr w:type="spellEnd"/>
     <w:r>
       <w:rPr>
         <w:lang w:val="en-IN"/>

</xml_diff>